<commit_message>
A minor edit to the documentation files
</commit_message>
<xml_diff>
--- a/documentation/graduation-1/Smart Survey Platform - Graduation 1 - Report (Chapters 1-3, draft).docx
+++ b/documentation/graduation-1/Smart Survey Platform - Graduation 1 - Report (Chapters 1-3, draft).docx
@@ -17,12 +17,6 @@
         <w:gridCol w:w="2400"/>
       </w:tblGrid>
       <w:tr>
-        <w:tblPrEx>
-          <w:tblCellMar>
-            <w:top w:w="0" w:type="dxa"/>
-            <w:bottom w:w="0" w:type="dxa"/>
-          </w:tblCellMar>
-        </w:tblPrEx>
         <w:tc>
           <w:tcPr>
             <w:tcW w:w="2400" w:type="dxa"/>
@@ -247,19 +241,9 @@
         <w:spacing w:after="80"/>
         <w:jc w:val="center"/>
       </w:pPr>
-      <w:proofErr w:type="spellStart"/>
-      <w:r>
-        <w:t>Yaman</w:t>
-      </w:r>
-      <w:proofErr w:type="spellEnd"/>
-      <w:r>
-        <w:t xml:space="preserve"> Bassam </w:t>
-      </w:r>
-      <w:proofErr w:type="spellStart"/>
-      <w:r>
-        <w:t>Almatar</w:t>
-      </w:r>
-      <w:proofErr w:type="spellEnd"/>
+      <w:r>
+        <w:t>Yaman Bassam Almatar</w:t>
+      </w:r>
     </w:p>
     <w:p>
       <w:pPr>
@@ -267,13 +251,8 @@
         <w:jc w:val="center"/>
       </w:pPr>
       <w:r>
-        <w:t xml:space="preserve">Yousef Ahmad </w:t>
-      </w:r>
-      <w:proofErr w:type="spellStart"/>
-      <w:r>
-        <w:t>Alzoubi</w:t>
-      </w:r>
-      <w:proofErr w:type="spellEnd"/>
+        <w:t>Yousef Ahmad Alzoubi</w:t>
+      </w:r>
     </w:p>
     <w:p>
       <w:pPr>
@@ -281,15 +260,7 @@
         <w:jc w:val="center"/>
       </w:pPr>
       <w:r>
-        <w:t xml:space="preserve">Hasan </w:t>
-      </w:r>
-      <w:proofErr w:type="spellStart"/>
-      <w:r>
-        <w:t>Abdalruhman</w:t>
-      </w:r>
-      <w:proofErr w:type="spellEnd"/>
-      <w:r>
-        <w:t xml:space="preserve"> Yahya</w:t>
+        <w:t>Hasan Abdalruhman Yahya</w:t>
       </w:r>
     </w:p>
     <w:p>
@@ -313,25 +284,14 @@
         <w:jc w:val="center"/>
       </w:pPr>
       <w:r>
-        <w:t xml:space="preserve">Eng. </w:t>
-      </w:r>
-      <w:proofErr w:type="spellStart"/>
-      <w:r>
-        <w:t>Shadi</w:t>
-      </w:r>
-      <w:proofErr w:type="spellEnd"/>
-      <w:r>
-        <w:t xml:space="preserve"> Blidi</w:t>
-      </w:r>
-    </w:p>
-    <w:p>
-      <w:pPr>
-        <w:spacing w:after="300"/>
+        <w:t>Eng. Shadi Blidi</w:t>
+      </w:r>
+    </w:p>
+    <w:p>
+      <w:pPr>
+        <w:spacing w:after="80"/>
         <w:jc w:val="center"/>
       </w:pPr>
-      <w:r>
-        <w:t>Eng. Mohammad Amer Khorshid</w:t>
-      </w:r>
     </w:p>
     <w:p>
       <w:pPr>
@@ -3690,21 +3650,8 @@
       <w:pPr>
         <w:jc w:val="both"/>
       </w:pPr>
-      <w:proofErr w:type="spellStart"/>
-      <w:r>
-        <w:t>Organisations</w:t>
-      </w:r>
-      <w:proofErr w:type="spellEnd"/>
-      <w:r>
-        <w:t xml:space="preserve"> use surveys to decide how to improve services, products and policies, but a survey result is only as reliable as the people who answered it and the care they took. Online distribution has made surveys cheap to send. It has also made them easy to answer carelessly, fraudulently, or by people outside the intended audience. Open-text answers, which often hold the most useful feedback, are the hardest part of a survey to </w:t>
-      </w:r>
-      <w:proofErr w:type="spellStart"/>
-      <w:r>
-        <w:t>analyse</w:t>
-      </w:r>
-      <w:proofErr w:type="spellEnd"/>
-      <w:r>
-        <w:t xml:space="preserve"> at scale.</w:t>
+      <w:r>
+        <w:t>Organisations use surveys to decide how to improve services, products and policies, but a survey result is only as reliable as the people who answered it and the care they took. Online distribution has made surveys cheap to send. It has also made them easy to answer carelessly, fraudulently, or by people outside the intended audience. Open-text answers, which often hold the most useful feedback, are the hardest part of a survey to analyse at scale.</w:t>
       </w:r>
     </w:p>
     <w:p>
@@ -3760,15 +3707,7 @@
         <w:t>response-quality engine</w:t>
       </w:r>
       <w:r>
-        <w:t xml:space="preserve"> flags </w:t>
-      </w:r>
-      <w:proofErr w:type="gramStart"/>
-      <w:r>
-        <w:t>low-quality responses</w:t>
-      </w:r>
-      <w:proofErr w:type="gramEnd"/>
-      <w:r>
-        <w:t xml:space="preserve">. Third, </w:t>
+        <w:t xml:space="preserve"> flags low-quality responses. Third, </w:t>
       </w:r>
       <w:r>
         <w:rPr>
@@ -3811,15 +3750,7 @@
         <w:t>No reviewed panel serves Syria.</w:t>
       </w:r>
       <w:r>
-        <w:t xml:space="preserve"> A survey owner in Syria who needs respondents matched by profile has no suitable option among the platforms reviewed in Chapter 3. The panels that target respondents by a stored profile do not list Syria: SurveyMonkey Audience [1] and Prolific [2] do not include it, and </w:t>
-      </w:r>
-      <w:proofErr w:type="spellStart"/>
-      <w:r>
-        <w:t>Pollfish</w:t>
-      </w:r>
-      <w:proofErr w:type="spellEnd"/>
-      <w:r>
-        <w:t xml:space="preserve"> does not list Arabic among its survey languages [3]. The general survey builders distribute a link, but they do not select respondents by profile.</w:t>
+        <w:t xml:space="preserve"> A survey owner in Syria who needs respondents matched by profile has no suitable option among the platforms reviewed in Chapter 3. The panels that target respondents by a stored profile do not list Syria: SurveyMonkey Audience [1] and Prolific [2] do not include it, and Pollfish does not list Arabic among its survey languages [3]. The general survey builders distribute a link, but they do not select respondents by profile.</w:t>
       </w:r>
     </w:p>
     <w:p>
@@ -3831,23 +3762,7 @@
           <w:b/>
           <w:bCs/>
         </w:rPr>
-        <w:t xml:space="preserve">Quality controls are mostly </w:t>
-      </w:r>
-      <w:proofErr w:type="gramStart"/>
-      <w:r>
-        <w:rPr>
-          <w:b/>
-          <w:bCs/>
-        </w:rPr>
-        <w:t>single-layer</w:t>
-      </w:r>
-      <w:proofErr w:type="gramEnd"/>
-      <w:r>
-        <w:rPr>
-          <w:b/>
-          <w:bCs/>
-        </w:rPr>
-        <w:t>.</w:t>
+        <w:t>Quality controls are mostly single-layer.</w:t>
       </w:r>
       <w:r>
         <w:t xml:space="preserve"> Builders typically offer one response per account or a CAPTCHA, while the evidence shows that one control is not enough. In a study that recruited participants through an open social-media link, 94.5% of 271 completed responses were fraudulent, and all of them passed the CAPTCHA [4]. More recent work shows that automated agents built on large language models now pass attention checks as well (Section 3.1).</w:t>
@@ -3866,15 +3781,7 @@
         <w:t>Automated analysis of open answers is paid and mostly English.</w:t>
       </w:r>
       <w:r>
-        <w:t xml:space="preserve"> </w:t>
-      </w:r>
-      <w:proofErr w:type="spellStart"/>
-      <w:r>
-        <w:t>Typeform's</w:t>
-      </w:r>
-      <w:proofErr w:type="spellEnd"/>
-      <w:r>
-        <w:t xml:space="preserve"> Smart Insights labels the sentiment of English forms only [5]. SurveyMonkey offers sentiment analysis on some paid plans without stating the supported languages [6]. Google Forms offers Gemini summaries on paid editions, without a label for each answer [7]. For Arabic answers, the survey owner is left with manual reading.</w:t>
+        <w:t xml:space="preserve"> Typeform's Smart Insights labels the sentiment of English forms only [5]. SurveyMonkey offers sentiment analysis on some paid plans without stating the supported languages [6]. Google Forms offers Gemini summaries on paid editions, without a label for each answer [7]. For Arabic answers, the survey owner is left with manual reading.</w:t>
       </w:r>
     </w:p>
     <w:p>
@@ -3890,15 +3797,7 @@
         <w:jc w:val="both"/>
       </w:pPr>
       <w:r>
-        <w:t xml:space="preserve">Academically, the problem combines requirements engineering, a layered architecture, a public REST API, a mobile client, data-quality methods from survey methodology, and the evaluation of natural language processing models for Arabic. Each part </w:t>
-      </w:r>
-      <w:proofErr w:type="gramStart"/>
-      <w:r>
-        <w:t>has to</w:t>
-      </w:r>
-      <w:proofErr w:type="gramEnd"/>
-      <w:r>
-        <w:t xml:space="preserve"> be justified with evidence and verified with tests, which makes the problem a suitable subject for a software engineering graduation project.</w:t>
+        <w:t>Academically, the problem combines requirements engineering, a layered architecture, a public REST API, a mobile client, data-quality methods from survey methodology, and the evaluation of natural language processing models for Arabic. Each part has to be justified with evidence and verified with tests, which makes the problem a suitable subject for a software engineering graduation project.</w:t>
       </w:r>
     </w:p>
     <w:p>
@@ -3956,12 +3855,6 @@
         <w:gridCol w:w="1225"/>
       </w:tblGrid>
       <w:tr>
-        <w:tblPrEx>
-          <w:tblCellMar>
-            <w:top w:w="0" w:type="dxa"/>
-            <w:bottom w:w="0" w:type="dxa"/>
-          </w:tblCellMar>
-        </w:tblPrEx>
         <w:trPr>
           <w:cantSplit/>
           <w:tblHeader/>
@@ -4101,12 +3994,6 @@
         </w:tc>
       </w:tr>
       <w:tr>
-        <w:tblPrEx>
-          <w:tblCellMar>
-            <w:top w:w="0" w:type="dxa"/>
-            <w:bottom w:w="0" w:type="dxa"/>
-          </w:tblCellMar>
-        </w:tblPrEx>
         <w:trPr>
           <w:cantSplit/>
           <w:jc w:val="center"/>
@@ -4233,12 +4120,6 @@
         </w:tc>
       </w:tr>
       <w:tr>
-        <w:tblPrEx>
-          <w:tblCellMar>
-            <w:top w:w="0" w:type="dxa"/>
-            <w:bottom w:w="0" w:type="dxa"/>
-          </w:tblCellMar>
-        </w:tblPrEx>
         <w:trPr>
           <w:cantSplit/>
           <w:jc w:val="center"/>
@@ -4365,12 +4246,6 @@
         </w:tc>
       </w:tr>
       <w:tr>
-        <w:tblPrEx>
-          <w:tblCellMar>
-            <w:top w:w="0" w:type="dxa"/>
-            <w:bottom w:w="0" w:type="dxa"/>
-          </w:tblCellMar>
-        </w:tblPrEx>
         <w:trPr>
           <w:cantSplit/>
           <w:jc w:val="center"/>
@@ -4497,12 +4372,6 @@
         </w:tc>
       </w:tr>
       <w:tr>
-        <w:tblPrEx>
-          <w:tblCellMar>
-            <w:top w:w="0" w:type="dxa"/>
-            <w:bottom w:w="0" w:type="dxa"/>
-          </w:tblCellMar>
-        </w:tblPrEx>
         <w:trPr>
           <w:cantSplit/>
           <w:jc w:val="center"/>
@@ -4630,12 +4499,6 @@
         </w:tc>
       </w:tr>
       <w:tr>
-        <w:tblPrEx>
-          <w:tblCellMar>
-            <w:top w:w="0" w:type="dxa"/>
-            <w:bottom w:w="0" w:type="dxa"/>
-          </w:tblCellMar>
-        </w:tblPrEx>
         <w:trPr>
           <w:cantSplit/>
           <w:jc w:val="center"/>
@@ -4762,12 +4625,6 @@
         </w:tc>
       </w:tr>
       <w:tr>
-        <w:tblPrEx>
-          <w:tblCellMar>
-            <w:top w:w="0" w:type="dxa"/>
-            <w:bottom w:w="0" w:type="dxa"/>
-          </w:tblCellMar>
-        </w:tblPrEx>
         <w:trPr>
           <w:cantSplit/>
           <w:jc w:val="center"/>
@@ -4952,12 +4809,6 @@
         <w:gridCol w:w="7525"/>
       </w:tblGrid>
       <w:tr>
-        <w:tblPrEx>
-          <w:tblCellMar>
-            <w:top w:w="0" w:type="dxa"/>
-            <w:bottom w:w="0" w:type="dxa"/>
-          </w:tblCellMar>
-        </w:tblPrEx>
         <w:trPr>
           <w:cantSplit/>
           <w:tblHeader/>
@@ -5031,12 +4882,6 @@
         </w:tc>
       </w:tr>
       <w:tr>
-        <w:tblPrEx>
-          <w:tblCellMar>
-            <w:top w:w="0" w:type="dxa"/>
-            <w:bottom w:w="0" w:type="dxa"/>
-          </w:tblCellMar>
-        </w:tblPrEx>
         <w:trPr>
           <w:cantSplit/>
           <w:jc w:val="center"/>
@@ -5105,12 +4950,6 @@
         </w:tc>
       </w:tr>
       <w:tr>
-        <w:tblPrEx>
-          <w:tblCellMar>
-            <w:top w:w="0" w:type="dxa"/>
-            <w:bottom w:w="0" w:type="dxa"/>
-          </w:tblCellMar>
-        </w:tblPrEx>
         <w:trPr>
           <w:cantSplit/>
           <w:jc w:val="center"/>
@@ -5179,12 +5018,6 @@
         </w:tc>
       </w:tr>
       <w:tr>
-        <w:tblPrEx>
-          <w:tblCellMar>
-            <w:top w:w="0" w:type="dxa"/>
-            <w:bottom w:w="0" w:type="dxa"/>
-          </w:tblCellMar>
-        </w:tblPrEx>
         <w:trPr>
           <w:cantSplit/>
           <w:jc w:val="center"/>
@@ -5253,12 +5086,6 @@
         </w:tc>
       </w:tr>
       <w:tr>
-        <w:tblPrEx>
-          <w:tblCellMar>
-            <w:top w:w="0" w:type="dxa"/>
-            <w:bottom w:w="0" w:type="dxa"/>
-          </w:tblCellMar>
-        </w:tblPrEx>
         <w:trPr>
           <w:cantSplit/>
           <w:jc w:val="center"/>
@@ -5328,12 +5155,6 @@
         </w:tc>
       </w:tr>
       <w:tr>
-        <w:tblPrEx>
-          <w:tblCellMar>
-            <w:top w:w="0" w:type="dxa"/>
-            <w:bottom w:w="0" w:type="dxa"/>
-          </w:tblCellMar>
-        </w:tblPrEx>
         <w:trPr>
           <w:cantSplit/>
           <w:jc w:val="center"/>
@@ -5492,23 +5313,7 @@
         <w:t>engineering (design-and-build) research methodology</w:t>
       </w:r>
       <w:r>
-        <w:t xml:space="preserve">: the problem is </w:t>
-      </w:r>
-      <w:proofErr w:type="spellStart"/>
-      <w:r>
-        <w:t>analysed</w:t>
-      </w:r>
-      <w:proofErr w:type="spellEnd"/>
-      <w:r>
-        <w:t xml:space="preserve">, requirements are derived, a system is designed and built, and the result is verified against measurable objectives. The software development methodology that </w:t>
-      </w:r>
-      <w:proofErr w:type="spellStart"/>
-      <w:r>
-        <w:t>organises</w:t>
-      </w:r>
-      <w:proofErr w:type="spellEnd"/>
-      <w:r>
-        <w:t xml:space="preserve"> this work in time is described separately in Chapter 2.</w:t>
+        <w:t>: the problem is analysed, requirements are derived, a system is designed and built, and the result is verified against measurable objectives. The software development methodology that organises this work in time is described separately in Chapter 2.</w:t>
       </w:r>
     </w:p>
     <w:p>
@@ -5591,12 +5396,6 @@
         <w:gridCol w:w="6773"/>
       </w:tblGrid>
       <w:tr>
-        <w:tblPrEx>
-          <w:tblCellMar>
-            <w:top w:w="0" w:type="dxa"/>
-            <w:bottom w:w="0" w:type="dxa"/>
-          </w:tblCellMar>
-        </w:tblPrEx>
         <w:trPr>
           <w:cantSplit/>
           <w:tblHeader/>
@@ -5670,12 +5469,6 @@
         </w:tc>
       </w:tr>
       <w:tr>
-        <w:tblPrEx>
-          <w:tblCellMar>
-            <w:top w:w="0" w:type="dxa"/>
-            <w:bottom w:w="0" w:type="dxa"/>
-          </w:tblCellMar>
-        </w:tblPrEx>
         <w:trPr>
           <w:cantSplit/>
           <w:jc w:val="center"/>
@@ -5744,12 +5537,6 @@
         </w:tc>
       </w:tr>
       <w:tr>
-        <w:tblPrEx>
-          <w:tblCellMar>
-            <w:top w:w="0" w:type="dxa"/>
-            <w:bottom w:w="0" w:type="dxa"/>
-          </w:tblCellMar>
-        </w:tblPrEx>
         <w:trPr>
           <w:cantSplit/>
           <w:jc w:val="center"/>
@@ -5818,12 +5605,6 @@
         </w:tc>
       </w:tr>
       <w:tr>
-        <w:tblPrEx>
-          <w:tblCellMar>
-            <w:top w:w="0" w:type="dxa"/>
-            <w:bottom w:w="0" w:type="dxa"/>
-          </w:tblCellMar>
-        </w:tblPrEx>
         <w:trPr>
           <w:cantSplit/>
           <w:jc w:val="center"/>
@@ -5892,12 +5673,6 @@
         </w:tc>
       </w:tr>
       <w:tr>
-        <w:tblPrEx>
-          <w:tblCellMar>
-            <w:top w:w="0" w:type="dxa"/>
-            <w:bottom w:w="0" w:type="dxa"/>
-          </w:tblCellMar>
-        </w:tblPrEx>
         <w:trPr>
           <w:cantSplit/>
           <w:jc w:val="center"/>
@@ -5966,12 +5741,6 @@
         </w:tc>
       </w:tr>
       <w:tr>
-        <w:tblPrEx>
-          <w:tblCellMar>
-            <w:top w:w="0" w:type="dxa"/>
-            <w:bottom w:w="0" w:type="dxa"/>
-          </w:tblCellMar>
-        </w:tblPrEx>
         <w:trPr>
           <w:cantSplit/>
           <w:jc w:val="center"/>
@@ -6040,12 +5809,6 @@
         </w:tc>
       </w:tr>
       <w:tr>
-        <w:tblPrEx>
-          <w:tblCellMar>
-            <w:top w:w="0" w:type="dxa"/>
-            <w:bottom w:w="0" w:type="dxa"/>
-          </w:tblCellMar>
-        </w:tblPrEx>
         <w:trPr>
           <w:cantSplit/>
           <w:jc w:val="center"/>
@@ -6108,34 +5871,12 @@
                 <w:sz w:val="22"/>
                 <w:szCs w:val="22"/>
               </w:rPr>
-              <w:t xml:space="preserve">A per-response value derived from the quality flags; flagged responses are </w:t>
-            </w:r>
-            <w:proofErr w:type="gramStart"/>
-            <w:r>
-              <w:rPr>
-                <w:sz w:val="22"/>
-                <w:szCs w:val="22"/>
-              </w:rPr>
-              <w:t>kept</w:t>
-            </w:r>
-            <w:proofErr w:type="gramEnd"/>
-            <w:r>
-              <w:rPr>
-                <w:sz w:val="22"/>
-                <w:szCs w:val="22"/>
-              </w:rPr>
-              <w:t xml:space="preserve"> and the provider decides whether to include them.</w:t>
+              <w:t>A per-response value derived from the quality flags; flagged responses are kept and the provider decides whether to include them.</w:t>
             </w:r>
           </w:p>
         </w:tc>
       </w:tr>
       <w:tr>
-        <w:tblPrEx>
-          <w:tblCellMar>
-            <w:top w:w="0" w:type="dxa"/>
-            <w:bottom w:w="0" w:type="dxa"/>
-          </w:tblCellMar>
-        </w:tblPrEx>
         <w:trPr>
           <w:cantSplit/>
           <w:jc w:val="center"/>
@@ -6204,12 +5945,6 @@
         </w:tc>
       </w:tr>
       <w:tr>
-        <w:tblPrEx>
-          <w:tblCellMar>
-            <w:top w:w="0" w:type="dxa"/>
-            <w:bottom w:w="0" w:type="dxa"/>
-          </w:tblCellMar>
-        </w:tblPrEx>
         <w:trPr>
           <w:cantSplit/>
           <w:jc w:val="center"/>
@@ -6278,12 +6013,6 @@
         </w:tc>
       </w:tr>
       <w:tr>
-        <w:tblPrEx>
-          <w:tblCellMar>
-            <w:top w:w="0" w:type="dxa"/>
-            <w:bottom w:w="0" w:type="dxa"/>
-          </w:tblCellMar>
-        </w:tblPrEx>
         <w:trPr>
           <w:cantSplit/>
           <w:jc w:val="center"/>
@@ -6352,12 +6081,6 @@
         </w:tc>
       </w:tr>
       <w:tr>
-        <w:tblPrEx>
-          <w:tblCellMar>
-            <w:top w:w="0" w:type="dxa"/>
-            <w:bottom w:w="0" w:type="dxa"/>
-          </w:tblCellMar>
-        </w:tblPrEx>
         <w:trPr>
           <w:cantSplit/>
           <w:jc w:val="center"/>
@@ -6426,12 +6149,6 @@
         </w:tc>
       </w:tr>
       <w:tr>
-        <w:tblPrEx>
-          <w:tblCellMar>
-            <w:top w:w="0" w:type="dxa"/>
-            <w:bottom w:w="0" w:type="dxa"/>
-          </w:tblCellMar>
-        </w:tblPrEx>
         <w:trPr>
           <w:cantSplit/>
           <w:jc w:val="center"/>
@@ -6500,12 +6217,6 @@
         </w:tc>
       </w:tr>
       <w:tr>
-        <w:tblPrEx>
-          <w:tblCellMar>
-            <w:top w:w="0" w:type="dxa"/>
-            <w:bottom w:w="0" w:type="dxa"/>
-          </w:tblCellMar>
-        </w:tblPrEx>
         <w:trPr>
           <w:cantSplit/>
           <w:jc w:val="center"/>
@@ -6574,12 +6285,6 @@
         </w:tc>
       </w:tr>
       <w:tr>
-        <w:tblPrEx>
-          <w:tblCellMar>
-            <w:top w:w="0" w:type="dxa"/>
-            <w:bottom w:w="0" w:type="dxa"/>
-          </w:tblCellMar>
-        </w:tblPrEx>
         <w:trPr>
           <w:cantSplit/>
           <w:jc w:val="center"/>
@@ -6648,12 +6353,6 @@
         </w:tc>
       </w:tr>
       <w:tr>
-        <w:tblPrEx>
-          <w:tblCellMar>
-            <w:top w:w="0" w:type="dxa"/>
-            <w:bottom w:w="0" w:type="dxa"/>
-          </w:tblCellMar>
-        </w:tblPrEx>
         <w:trPr>
           <w:cantSplit/>
           <w:jc w:val="center"/>
@@ -6717,34 +6416,12 @@
                 <w:sz w:val="22"/>
                 <w:szCs w:val="22"/>
               </w:rPr>
-              <w:t xml:space="preserve">An </w:t>
-            </w:r>
-            <w:proofErr w:type="spellStart"/>
-            <w:r>
-              <w:rPr>
-                <w:sz w:val="22"/>
-                <w:szCs w:val="22"/>
-              </w:rPr>
-              <w:t>organisation</w:t>
-            </w:r>
-            <w:proofErr w:type="spellEnd"/>
-            <w:r>
-              <w:rPr>
-                <w:sz w:val="22"/>
-                <w:szCs w:val="22"/>
-              </w:rPr>
-              <w:t xml:space="preserve"> of the application into presentation, business and data source layers, where each layer uses only the layer below it.</w:t>
+              <w:t>An organisation of the application into presentation, business and data source layers, where each layer uses only the layer below it.</w:t>
             </w:r>
           </w:p>
         </w:tc>
       </w:tr>
       <w:tr>
-        <w:tblPrEx>
-          <w:tblCellMar>
-            <w:top w:w="0" w:type="dxa"/>
-            <w:bottom w:w="0" w:type="dxa"/>
-          </w:tblCellMar>
-        </w:tblPrEx>
         <w:trPr>
           <w:cantSplit/>
           <w:jc w:val="center"/>
@@ -6813,12 +6490,6 @@
         </w:tc>
       </w:tr>
       <w:tr>
-        <w:tblPrEx>
-          <w:tblCellMar>
-            <w:top w:w="0" w:type="dxa"/>
-            <w:bottom w:w="0" w:type="dxa"/>
-          </w:tblCellMar>
-        </w:tblPrEx>
         <w:trPr>
           <w:cantSplit/>
           <w:jc w:val="center"/>
@@ -6887,12 +6558,6 @@
         </w:tc>
       </w:tr>
       <w:tr>
-        <w:tblPrEx>
-          <w:tblCellMar>
-            <w:top w:w="0" w:type="dxa"/>
-            <w:bottom w:w="0" w:type="dxa"/>
-          </w:tblCellMar>
-        </w:tblPrEx>
         <w:trPr>
           <w:cantSplit/>
           <w:jc w:val="center"/>
@@ -6961,12 +6626,6 @@
         </w:tc>
       </w:tr>
       <w:tr>
-        <w:tblPrEx>
-          <w:tblCellMar>
-            <w:top w:w="0" w:type="dxa"/>
-            <w:bottom w:w="0" w:type="dxa"/>
-          </w:tblCellMar>
-        </w:tblPrEx>
         <w:trPr>
           <w:cantSplit/>
           <w:jc w:val="center"/>
@@ -7035,12 +6694,6 @@
         </w:tc>
       </w:tr>
       <w:tr>
-        <w:tblPrEx>
-          <w:tblCellMar>
-            <w:top w:w="0" w:type="dxa"/>
-            <w:bottom w:w="0" w:type="dxa"/>
-          </w:tblCellMar>
-        </w:tblPrEx>
         <w:trPr>
           <w:cantSplit/>
           <w:jc w:val="center"/>
@@ -7109,12 +6762,6 @@
         </w:tc>
       </w:tr>
       <w:tr>
-        <w:tblPrEx>
-          <w:tblCellMar>
-            <w:top w:w="0" w:type="dxa"/>
-            <w:bottom w:w="0" w:type="dxa"/>
-          </w:tblCellMar>
-        </w:tblPrEx>
         <w:trPr>
           <w:cantSplit/>
           <w:jc w:val="center"/>
@@ -7183,12 +6830,6 @@
         </w:tc>
       </w:tr>
       <w:tr>
-        <w:tblPrEx>
-          <w:tblCellMar>
-            <w:top w:w="0" w:type="dxa"/>
-            <w:bottom w:w="0" w:type="dxa"/>
-          </w:tblCellMar>
-        </w:tblPrEx>
         <w:trPr>
           <w:cantSplit/>
           <w:jc w:val="center"/>
@@ -7257,12 +6898,6 @@
         </w:tc>
       </w:tr>
       <w:tr>
-        <w:tblPrEx>
-          <w:tblCellMar>
-            <w:top w:w="0" w:type="dxa"/>
-            <w:bottom w:w="0" w:type="dxa"/>
-          </w:tblCellMar>
-        </w:tblPrEx>
         <w:trPr>
           <w:cantSplit/>
           <w:jc w:val="center"/>
@@ -7288,7 +6923,6 @@
             <w:pPr>
               <w:spacing w:after="0" w:line="240" w:lineRule="auto"/>
             </w:pPr>
-            <w:proofErr w:type="spellStart"/>
             <w:r>
               <w:rPr>
                 <w:b/>
@@ -7298,7 +6932,6 @@
               </w:rPr>
               <w:t>MoSCoW</w:t>
             </w:r>
-            <w:proofErr w:type="spellEnd"/>
           </w:p>
         </w:tc>
         <w:tc>
@@ -7327,23 +6960,7 @@
                 <w:sz w:val="22"/>
                 <w:szCs w:val="22"/>
               </w:rPr>
-              <w:t xml:space="preserve">A </w:t>
-            </w:r>
-            <w:proofErr w:type="spellStart"/>
-            <w:r>
-              <w:rPr>
-                <w:sz w:val="22"/>
-                <w:szCs w:val="22"/>
-              </w:rPr>
-              <w:t>prioritisation</w:t>
-            </w:r>
-            <w:proofErr w:type="spellEnd"/>
-            <w:r>
-              <w:rPr>
-                <w:sz w:val="22"/>
-                <w:szCs w:val="22"/>
-              </w:rPr>
-              <w:t xml:space="preserve"> method that labels requirements Must, Should, Could or Won't have this time.</w:t>
+              <w:t>A prioritisation method that labels requirements Must, Should, Could or Won't have this time.</w:t>
             </w:r>
           </w:p>
         </w:tc>
@@ -7389,15 +7006,7 @@
         <w:jc w:val="both"/>
       </w:pPr>
       <w:r>
-        <w:t xml:space="preserve">Four reasons support this choice. First, the team works in a hybrid pattern: on some days the three members work together, and on other days each works alone from home. Scrum, which the team adopted first, defines a Daily Scrum held at the same time and place every working day and separate Product Owner and Scrum Master accountabilities, and its guide states that implementing only parts of Scrum does not produce Scrum [11]; the team could not hold these events in their defined form. Kanban prescribes no roles, events or location; its minimum is an explicit Definition of Workflow, explicit control of the work in progress (WIP) and four flow metrics [8], all of which the team can apply and show from its GitHub records. Second, the requirements changed several times through supervisor feedback before development started: the respondent interface moved from web pages to a mobile application, provider and administrator interfaces were kept on the web, the supported Arabic varieties were revised, and the number of Graduation Project 1 requirements was settled at 20 after two review rounds; continuous pulling from an ordered backlog absorbs such changes without re-planning a fixed scope. Third, the university calendar fixes the dates of the seminars, the report and the </w:t>
-      </w:r>
-      <w:proofErr w:type="spellStart"/>
-      <w:r>
-        <w:t>defence</w:t>
-      </w:r>
-      <w:proofErr w:type="spellEnd"/>
-      <w:r>
-        <w:t>, so the team adds a two-week delivery cadence to the flow. Fourth, studies of student projects support the choice: in a controlled comparison of four approaches in semester-long data science student projects, a Kanban approach was much more effective than Scrum [12], and a study of Scrum in software capstone courses found that daily stand-up meetings in every class were not helpful and that Scrum had to be adapted to students' workloads and schedules [13].</w:t>
+        <w:t>Four reasons support this choice. First, the team works in a hybrid pattern: on some days the three members work together, and on other days each works alone from home. Scrum, which the team adopted first, defines a Daily Scrum held at the same time and place every working day and separate Product Owner and Scrum Master accountabilities, and its guide states that implementing only parts of Scrum does not produce Scrum [11]; the team could not hold these events in their defined form. Kanban prescribes no roles, events or location; its minimum is an explicit Definition of Workflow, explicit control of the work in progress (WIP) and four flow metrics [8], all of which the team can apply and show from its GitHub records. Second, the requirements changed several times through supervisor feedback before development started: the respondent interface moved from web pages to a mobile application, provider and administrator interfaces were kept on the web, the supported Arabic varieties were revised, and the number of Graduation Project 1 requirements was settled at 20 after two review rounds; continuous pulling from an ordered backlog absorbs such changes without re-planning a fixed scope. Third, the university calendar fixes the dates of the seminars, the report and the defence, so the team adds a two-week delivery cadence to the flow. Fourth, studies of student projects support the choice: in a controlled comparison of four approaches in semester-long data science student projects, a Kanban approach was much more effective than Scrum [12], and a study of Scrum in software capstone courses found that daily stand-up meetings in every class were not helpful and that Scrum had to be adapted to students' workloads and schedules [13].</w:t>
       </w:r>
     </w:p>
     <w:p>
@@ -7483,15 +7092,7 @@
         <w:jc w:val="both"/>
       </w:pPr>
       <w:r>
-        <w:t xml:space="preserve">Table 2.1 gives the Definition of Workflow, the explicit agreement that the Kanban Guide requires [8]. A work item is one backlog issue. Work on an item starts when its branch is created and finishes when its pull request is merged into the integration branch; the release of the Increment to the main branch is recorded as a further state. The service level expectation is an initial estimate, as the guide allows until enough cycle-time data exists, and it is recalculated after the first two weeks [8]. The Definition of Done requires that the automated tests pass in continuous integration, that another member has reviewed the pull request, that the affected diagrams are updated and that the item's report section and </w:t>
-      </w:r>
-      <w:proofErr w:type="spellStart"/>
-      <w:r>
-        <w:t>defence</w:t>
-      </w:r>
-      <w:proofErr w:type="spellEnd"/>
-      <w:r>
-        <w:t xml:space="preserve"> questions are written.</w:t>
+        <w:t>Table 2.1 gives the Definition of Workflow, the explicit agreement that the Kanban Guide requires [8]. A work item is one backlog issue. Work on an item starts when its branch is created and finishes when its pull request is merged into the integration branch; the release of the Increment to the main branch is recorded as a further state. The service level expectation is an initial estimate, as the guide allows until enough cycle-time data exists, and it is recalculated after the first two weeks [8]. The Definition of Done requires that the automated tests pass in continuous integration, that another member has reviewed the pull request, that the affected diagrams are updated and that the item's report section and defence questions are written.</w:t>
       </w:r>
     </w:p>
     <w:p>
@@ -7529,12 +7130,6 @@
         <w:gridCol w:w="6585"/>
       </w:tblGrid>
       <w:tr>
-        <w:tblPrEx>
-          <w:tblCellMar>
-            <w:top w:w="0" w:type="dxa"/>
-            <w:bottom w:w="0" w:type="dxa"/>
-          </w:tblCellMar>
-        </w:tblPrEx>
         <w:trPr>
           <w:cantSplit/>
           <w:tblHeader/>
@@ -7608,12 +7203,6 @@
         </w:tc>
       </w:tr>
       <w:tr>
-        <w:tblPrEx>
-          <w:tblCellMar>
-            <w:top w:w="0" w:type="dxa"/>
-            <w:bottom w:w="0" w:type="dxa"/>
-          </w:tblCellMar>
-        </w:tblPrEx>
         <w:trPr>
           <w:cantSplit/>
           <w:jc w:val="center"/>
@@ -7682,12 +7271,6 @@
         </w:tc>
       </w:tr>
       <w:tr>
-        <w:tblPrEx>
-          <w:tblCellMar>
-            <w:top w:w="0" w:type="dxa"/>
-            <w:bottom w:w="0" w:type="dxa"/>
-          </w:tblCellMar>
-        </w:tblPrEx>
         <w:trPr>
           <w:cantSplit/>
           <w:jc w:val="center"/>
@@ -7756,12 +7339,6 @@
         </w:tc>
       </w:tr>
       <w:tr>
-        <w:tblPrEx>
-          <w:tblCellMar>
-            <w:top w:w="0" w:type="dxa"/>
-            <w:bottom w:w="0" w:type="dxa"/>
-          </w:tblCellMar>
-        </w:tblPrEx>
         <w:trPr>
           <w:cantSplit/>
           <w:jc w:val="center"/>
@@ -7830,12 +7407,6 @@
         </w:tc>
       </w:tr>
       <w:tr>
-        <w:tblPrEx>
-          <w:tblCellMar>
-            <w:top w:w="0" w:type="dxa"/>
-            <w:bottom w:w="0" w:type="dxa"/>
-          </w:tblCellMar>
-        </w:tblPrEx>
         <w:trPr>
           <w:cantSplit/>
           <w:jc w:val="center"/>
@@ -7904,12 +7475,6 @@
         </w:tc>
       </w:tr>
       <w:tr>
-        <w:tblPrEx>
-          <w:tblCellMar>
-            <w:top w:w="0" w:type="dxa"/>
-            <w:bottom w:w="0" w:type="dxa"/>
-          </w:tblCellMar>
-        </w:tblPrEx>
         <w:trPr>
           <w:cantSplit/>
           <w:jc w:val="center"/>
@@ -7972,50 +7537,12 @@
                 <w:sz w:val="22"/>
                 <w:szCs w:val="22"/>
               </w:rPr>
-              <w:t xml:space="preserve">An item enters Ready only with acceptance criteria and a </w:t>
-            </w:r>
-            <w:proofErr w:type="spellStart"/>
-            <w:r>
-              <w:rPr>
-                <w:sz w:val="22"/>
-                <w:szCs w:val="22"/>
-              </w:rPr>
-              <w:t>MoSCoW</w:t>
-            </w:r>
-            <w:proofErr w:type="spellEnd"/>
-            <w:r>
-              <w:rPr>
-                <w:sz w:val="22"/>
-                <w:szCs w:val="22"/>
-              </w:rPr>
-              <w:t xml:space="preserve"> priority; items are pulled in the order Must, Should, </w:t>
-            </w:r>
-            <w:proofErr w:type="gramStart"/>
-            <w:r>
-              <w:rPr>
-                <w:sz w:val="22"/>
-                <w:szCs w:val="22"/>
-              </w:rPr>
-              <w:t>Could</w:t>
-            </w:r>
-            <w:proofErr w:type="gramEnd"/>
-            <w:r>
-              <w:rPr>
-                <w:sz w:val="22"/>
-                <w:szCs w:val="22"/>
-              </w:rPr>
-              <w:t>; a pull request is reviewed by a member who did not write it; an item moves to Done only when it meets the Definition of Done; blocked items are labelled and answered within 24 hours.</w:t>
+              <w:t>An item enters Ready only with acceptance criteria and a MoSCoW priority; items are pulled in the order Must, Should, Could; a pull request is reviewed by a member who did not write it; an item moves to Done only when it meets the Definition of Done; blocked items are labelled and answered within 24 hours.</w:t>
             </w:r>
           </w:p>
         </w:tc>
       </w:tr>
       <w:tr>
-        <w:tblPrEx>
-          <w:tblCellMar>
-            <w:top w:w="0" w:type="dxa"/>
-            <w:bottom w:w="0" w:type="dxa"/>
-          </w:tblCellMar>
-        </w:tblPrEx>
         <w:trPr>
           <w:cantSplit/>
           <w:jc w:val="center"/>
@@ -8145,12 +7672,6 @@
         <w:gridCol w:w="4328"/>
       </w:tblGrid>
       <w:tr>
-        <w:tblPrEx>
-          <w:tblCellMar>
-            <w:top w:w="0" w:type="dxa"/>
-            <w:bottom w:w="0" w:type="dxa"/>
-          </w:tblCellMar>
-        </w:tblPrEx>
         <w:trPr>
           <w:cantSplit/>
           <w:tblHeader/>
@@ -8290,12 +7811,6 @@
         </w:tc>
       </w:tr>
       <w:tr>
-        <w:tblPrEx>
-          <w:tblCellMar>
-            <w:top w:w="0" w:type="dxa"/>
-            <w:bottom w:w="0" w:type="dxa"/>
-          </w:tblCellMar>
-        </w:tblPrEx>
         <w:trPr>
           <w:cantSplit/>
           <w:jc w:val="center"/>
@@ -8416,34 +7931,12 @@
                 <w:sz w:val="22"/>
                 <w:szCs w:val="22"/>
               </w:rPr>
-              <w:t xml:space="preserve">Literature review and platform benchmark; FR-01 to FR-20 and NFR-01 to NFR-07 with </w:t>
-            </w:r>
-            <w:proofErr w:type="spellStart"/>
-            <w:r>
-              <w:rPr>
-                <w:sz w:val="22"/>
-                <w:szCs w:val="22"/>
-              </w:rPr>
-              <w:t>MoSCoW</w:t>
-            </w:r>
-            <w:proofErr w:type="spellEnd"/>
-            <w:r>
-              <w:rPr>
-                <w:sz w:val="22"/>
-                <w:szCs w:val="22"/>
-              </w:rPr>
-              <w:t xml:space="preserve"> priorities; use case, architecture and initial class diagrams; Product Backlog on a Kanban board; REST API and Flutter login, registration and survey list; Seminar 1.</w:t>
+              <w:t>Literature review and platform benchmark; FR-01 to FR-20 and NFR-01 to NFR-07 with MoSCoW priorities; use case, architecture and initial class diagrams; Product Backlog on a Kanban board; REST API and Flutter login, registration and survey list; Seminar 1.</w:t>
             </w:r>
           </w:p>
         </w:tc>
       </w:tr>
       <w:tr>
-        <w:tblPrEx>
-          <w:tblCellMar>
-            <w:top w:w="0" w:type="dxa"/>
-            <w:bottom w:w="0" w:type="dxa"/>
-          </w:tblCellMar>
-        </w:tblPrEx>
         <w:trPr>
           <w:cantSplit/>
           <w:jc w:val="center"/>
@@ -8570,12 +8063,6 @@
         </w:tc>
       </w:tr>
       <w:tr>
-        <w:tblPrEx>
-          <w:tblCellMar>
-            <w:top w:w="0" w:type="dxa"/>
-            <w:bottom w:w="0" w:type="dxa"/>
-          </w:tblCellMar>
-        </w:tblPrEx>
         <w:trPr>
           <w:cantSplit/>
           <w:jc w:val="center"/>
@@ -8702,12 +8189,6 @@
         </w:tc>
       </w:tr>
       <w:tr>
-        <w:tblPrEx>
-          <w:tblCellMar>
-            <w:top w:w="0" w:type="dxa"/>
-            <w:bottom w:w="0" w:type="dxa"/>
-          </w:tblCellMar>
-        </w:tblPrEx>
         <w:trPr>
           <w:cantSplit/>
           <w:jc w:val="center"/>
@@ -8834,12 +8315,6 @@
         </w:tc>
       </w:tr>
       <w:tr>
-        <w:tblPrEx>
-          <w:tblCellMar>
-            <w:top w:w="0" w:type="dxa"/>
-            <w:bottom w:w="0" w:type="dxa"/>
-          </w:tblCellMar>
-        </w:tblPrEx>
         <w:trPr>
           <w:cantSplit/>
           <w:jc w:val="center"/>
@@ -8960,34 +8435,12 @@
                 <w:sz w:val="22"/>
                 <w:szCs w:val="22"/>
               </w:rPr>
-              <w:t xml:space="preserve">Advanced analytics, export, account security; then </w:t>
-            </w:r>
-            <w:proofErr w:type="spellStart"/>
-            <w:r>
-              <w:rPr>
-                <w:sz w:val="22"/>
-                <w:szCs w:val="22"/>
-              </w:rPr>
-              <w:t>the</w:t>
-            </w:r>
-            <w:proofErr w:type="spellEnd"/>
-            <w:r>
-              <w:rPr>
-                <w:sz w:val="22"/>
-                <w:szCs w:val="22"/>
-              </w:rPr>
-              <w:t xml:space="preserve"> Could items as time allows. Feature freeze on 27 December.</w:t>
+              <w:t>Advanced analytics, export, account security; then the Could items as time allows. Feature freeze on 27 December.</w:t>
             </w:r>
           </w:p>
         </w:tc>
       </w:tr>
       <w:tr>
-        <w:tblPrEx>
-          <w:tblCellMar>
-            <w:top w:w="0" w:type="dxa"/>
-            <w:bottom w:w="0" w:type="dxa"/>
-          </w:tblCellMar>
-        </w:tblPrEx>
         <w:trPr>
           <w:cantSplit/>
           <w:jc w:val="center"/>
@@ -9269,12 +8722,6 @@
         <w:gridCol w:w="3765"/>
       </w:tblGrid>
       <w:tr>
-        <w:tblPrEx>
-          <w:tblCellMar>
-            <w:top w:w="0" w:type="dxa"/>
-            <w:bottom w:w="0" w:type="dxa"/>
-          </w:tblCellMar>
-        </w:tblPrEx>
         <w:trPr>
           <w:cantSplit/>
           <w:tblHeader/>
@@ -9447,12 +8894,6 @@
         </w:tc>
       </w:tr>
       <w:tr>
-        <w:tblPrEx>
-          <w:tblCellMar>
-            <w:top w:w="0" w:type="dxa"/>
-            <w:bottom w:w="0" w:type="dxa"/>
-          </w:tblCellMar>
-        </w:tblPrEx>
         <w:trPr>
           <w:cantSplit/>
           <w:jc w:val="center"/>
@@ -9603,34 +9044,12 @@
                 <w:sz w:val="22"/>
                 <w:szCs w:val="22"/>
               </w:rPr>
-              <w:t xml:space="preserve">The response is stored first; open answers are </w:t>
-            </w:r>
-            <w:proofErr w:type="spellStart"/>
-            <w:r>
-              <w:rPr>
-                <w:sz w:val="22"/>
-                <w:szCs w:val="22"/>
-              </w:rPr>
-              <w:t>analysed</w:t>
-            </w:r>
-            <w:proofErr w:type="spellEnd"/>
-            <w:r>
-              <w:rPr>
-                <w:sz w:val="22"/>
-                <w:szCs w:val="22"/>
-              </w:rPr>
-              <w:t xml:space="preserve"> afterwards and shown as pending until then (NFR-01). Cost and latency are selection criteria in T-2.</w:t>
+              <w:t>The response is stored first; open answers are analysed afterwards and shown as pending until then (NFR-01). Cost and latency are selection criteria in T-2.</w:t>
             </w:r>
           </w:p>
         </w:tc>
       </w:tr>
       <w:tr>
-        <w:tblPrEx>
-          <w:tblCellMar>
-            <w:top w:w="0" w:type="dxa"/>
-            <w:bottom w:w="0" w:type="dxa"/>
-          </w:tblCellMar>
-        </w:tblPrEx>
         <w:trPr>
           <w:cantSplit/>
           <w:jc w:val="center"/>
@@ -9787,12 +9206,6 @@
         </w:tc>
       </w:tr>
       <w:tr>
-        <w:tblPrEx>
-          <w:tblCellMar>
-            <w:top w:w="0" w:type="dxa"/>
-            <w:bottom w:w="0" w:type="dxa"/>
-          </w:tblCellMar>
-        </w:tblPrEx>
         <w:trPr>
           <w:cantSplit/>
           <w:jc w:val="center"/>
@@ -9949,12 +9362,6 @@
         </w:tc>
       </w:tr>
       <w:tr>
-        <w:tblPrEx>
-          <w:tblCellMar>
-            <w:top w:w="0" w:type="dxa"/>
-            <w:bottom w:w="0" w:type="dxa"/>
-          </w:tblCellMar>
-        </w:tblPrEx>
         <w:trPr>
           <w:cantSplit/>
           <w:jc w:val="center"/>
@@ -10105,34 +9512,12 @@
                 <w:sz w:val="22"/>
                 <w:szCs w:val="22"/>
               </w:rPr>
-              <w:t xml:space="preserve">A minimal stack (http, secure storage, Navigator and </w:t>
-            </w:r>
-            <w:proofErr w:type="spellStart"/>
-            <w:r>
-              <w:rPr>
-                <w:sz w:val="22"/>
-                <w:szCs w:val="22"/>
-              </w:rPr>
-              <w:t>setState</w:t>
-            </w:r>
-            <w:proofErr w:type="spellEnd"/>
-            <w:r>
-              <w:rPr>
-                <w:sz w:val="22"/>
-                <w:szCs w:val="22"/>
-              </w:rPr>
-              <w:t>); screens designed before coding; app work starts in Increment 1.</w:t>
+              <w:t>A minimal stack (http, secure storage, Navigator and setState); screens designed before coding; app work starts in Increment 1.</w:t>
             </w:r>
           </w:p>
         </w:tc>
       </w:tr>
       <w:tr>
-        <w:tblPrEx>
-          <w:tblCellMar>
-            <w:top w:w="0" w:type="dxa"/>
-            <w:bottom w:w="0" w:type="dxa"/>
-          </w:tblCellMar>
-        </w:tblPrEx>
         <w:trPr>
           <w:cantSplit/>
           <w:jc w:val="center"/>
@@ -10278,32 +9663,17 @@
             <w:pPr>
               <w:spacing w:after="0" w:line="240" w:lineRule="auto"/>
             </w:pPr>
-            <w:proofErr w:type="spellStart"/>
-            <w:r>
-              <w:rPr>
-                <w:sz w:val="22"/>
-                <w:szCs w:val="22"/>
-              </w:rPr>
-              <w:t>MoSCoW</w:t>
-            </w:r>
-            <w:proofErr w:type="spellEnd"/>
-            <w:r>
-              <w:rPr>
-                <w:sz w:val="22"/>
-                <w:szCs w:val="22"/>
-              </w:rPr>
-              <w:t xml:space="preserve"> order; Could items pulled last and dropped first; feature freeze on 27 December.</w:t>
+            <w:r>
+              <w:rPr>
+                <w:sz w:val="22"/>
+                <w:szCs w:val="22"/>
+              </w:rPr>
+              <w:t>MoSCoW order; Could items pulled last and dropped first; feature freeze on 27 December.</w:t>
             </w:r>
           </w:p>
         </w:tc>
       </w:tr>
       <w:tr>
-        <w:tblPrEx>
-          <w:tblCellMar>
-            <w:top w:w="0" w:type="dxa"/>
-            <w:bottom w:w="0" w:type="dxa"/>
-          </w:tblCellMar>
-        </w:tblPrEx>
         <w:trPr>
           <w:cantSplit/>
           <w:jc w:val="center"/>
@@ -10460,12 +9830,6 @@
         </w:tc>
       </w:tr>
       <w:tr>
-        <w:tblPrEx>
-          <w:tblCellMar>
-            <w:top w:w="0" w:type="dxa"/>
-            <w:bottom w:w="0" w:type="dxa"/>
-          </w:tblCellMar>
-        </w:tblPrEx>
         <w:trPr>
           <w:cantSplit/>
           <w:jc w:val="center"/>
@@ -10622,12 +9986,6 @@
         </w:tc>
       </w:tr>
       <w:tr>
-        <w:tblPrEx>
-          <w:tblCellMar>
-            <w:top w:w="0" w:type="dxa"/>
-            <w:bottom w:w="0" w:type="dxa"/>
-          </w:tblCellMar>
-        </w:tblPrEx>
         <w:trPr>
           <w:cantSplit/>
           <w:jc w:val="center"/>
@@ -10784,12 +10142,6 @@
         </w:tc>
       </w:tr>
       <w:tr>
-        <w:tblPrEx>
-          <w:tblCellMar>
-            <w:top w:w="0" w:type="dxa"/>
-            <w:bottom w:w="0" w:type="dxa"/>
-          </w:tblCellMar>
-        </w:tblPrEx>
         <w:trPr>
           <w:cantSplit/>
           <w:jc w:val="center"/>
@@ -10946,12 +10298,6 @@
         </w:tc>
       </w:tr>
       <w:tr>
-        <w:tblPrEx>
-          <w:tblCellMar>
-            <w:top w:w="0" w:type="dxa"/>
-            <w:bottom w:w="0" w:type="dxa"/>
-          </w:tblCellMar>
-        </w:tblPrEx>
         <w:trPr>
           <w:cantSplit/>
           <w:jc w:val="center"/>
@@ -11109,12 +10455,6 @@
         </w:tc>
       </w:tr>
       <w:tr>
-        <w:tblPrEx>
-          <w:tblCellMar>
-            <w:top w:w="0" w:type="dxa"/>
-            <w:bottom w:w="0" w:type="dxa"/>
-          </w:tblCellMar>
-        </w:tblPrEx>
         <w:trPr>
           <w:cantSplit/>
           <w:jc w:val="center"/>
@@ -11271,12 +10611,6 @@
         </w:tc>
       </w:tr>
       <w:tr>
-        <w:tblPrEx>
-          <w:tblCellMar>
-            <w:top w:w="0" w:type="dxa"/>
-            <w:bottom w:w="0" w:type="dxa"/>
-          </w:tblCellMar>
-        </w:tblPrEx>
         <w:trPr>
           <w:cantSplit/>
           <w:jc w:val="center"/>
@@ -11433,12 +10767,6 @@
         </w:tc>
       </w:tr>
       <w:tr>
-        <w:tblPrEx>
-          <w:tblCellMar>
-            <w:top w:w="0" w:type="dxa"/>
-            <w:bottom w:w="0" w:type="dxa"/>
-          </w:tblCellMar>
-        </w:tblPrEx>
         <w:trPr>
           <w:cantSplit/>
           <w:jc w:val="center"/>
@@ -11655,12 +10983,6 @@
         <w:gridCol w:w="3951"/>
       </w:tblGrid>
       <w:tr>
-        <w:tblPrEx>
-          <w:tblCellMar>
-            <w:top w:w="0" w:type="dxa"/>
-            <w:bottom w:w="0" w:type="dxa"/>
-          </w:tblCellMar>
-        </w:tblPrEx>
         <w:trPr>
           <w:cantSplit/>
           <w:tblHeader/>
@@ -11800,12 +11122,6 @@
         </w:tc>
       </w:tr>
       <w:tr>
-        <w:tblPrEx>
-          <w:tblCellMar>
-            <w:top w:w="0" w:type="dxa"/>
-            <w:bottom w:w="0" w:type="dxa"/>
-          </w:tblCellMar>
-        </w:tblPrEx>
         <w:trPr>
           <w:cantSplit/>
           <w:jc w:val="center"/>
@@ -11831,7 +11147,6 @@
             <w:pPr>
               <w:spacing w:after="0" w:line="240" w:lineRule="auto"/>
             </w:pPr>
-            <w:proofErr w:type="spellStart"/>
             <w:r>
               <w:rPr>
                 <w:b/>
@@ -11839,29 +11154,8 @@
                 <w:sz w:val="22"/>
                 <w:szCs w:val="22"/>
               </w:rPr>
-              <w:t>Yaman</w:t>
-            </w:r>
-            <w:proofErr w:type="spellEnd"/>
-            <w:r>
-              <w:rPr>
-                <w:b/>
-                <w:bCs/>
-                <w:sz w:val="22"/>
-                <w:szCs w:val="22"/>
-              </w:rPr>
-              <w:t xml:space="preserve"> </w:t>
-            </w:r>
-            <w:proofErr w:type="spellStart"/>
-            <w:r>
-              <w:rPr>
-                <w:b/>
-                <w:bCs/>
-                <w:sz w:val="22"/>
-                <w:szCs w:val="22"/>
-              </w:rPr>
-              <w:t>Almatar</w:t>
-            </w:r>
-            <w:proofErr w:type="spellEnd"/>
+              <w:t>Yaman Almatar</w:t>
+            </w:r>
           </w:p>
         </w:tc>
         <w:tc>
@@ -11956,12 +11250,6 @@
         </w:tc>
       </w:tr>
       <w:tr>
-        <w:tblPrEx>
-          <w:tblCellMar>
-            <w:top w:w="0" w:type="dxa"/>
-            <w:bottom w:w="0" w:type="dxa"/>
-          </w:tblCellMar>
-        </w:tblPrEx>
         <w:trPr>
           <w:cantSplit/>
           <w:jc w:val="center"/>
@@ -11994,19 +11282,8 @@
                 <w:sz w:val="22"/>
                 <w:szCs w:val="22"/>
               </w:rPr>
-              <w:t xml:space="preserve">Yousef </w:t>
-            </w:r>
-            <w:proofErr w:type="spellStart"/>
-            <w:r>
-              <w:rPr>
-                <w:b/>
-                <w:bCs/>
-                <w:sz w:val="22"/>
-                <w:szCs w:val="22"/>
-              </w:rPr>
-              <w:t>Alzoubi</w:t>
-            </w:r>
-            <w:proofErr w:type="spellEnd"/>
+              <w:t>Yousef Alzoubi</w:t>
+            </w:r>
           </w:p>
         </w:tc>
         <w:tc>
@@ -12101,12 +11378,6 @@
         </w:tc>
       </w:tr>
       <w:tr>
-        <w:tblPrEx>
-          <w:tblCellMar>
-            <w:top w:w="0" w:type="dxa"/>
-            <w:bottom w:w="0" w:type="dxa"/>
-          </w:tblCellMar>
-        </w:tblPrEx>
         <w:trPr>
           <w:cantSplit/>
           <w:jc w:val="center"/>
@@ -12235,12 +11506,6 @@
         </w:tc>
       </w:tr>
       <w:tr>
-        <w:tblPrEx>
-          <w:tblCellMar>
-            <w:top w:w="0" w:type="dxa"/>
-            <w:bottom w:w="0" w:type="dxa"/>
-          </w:tblCellMar>
-        </w:tblPrEx>
         <w:trPr>
           <w:cantSplit/>
           <w:jc w:val="center"/>
@@ -12273,27 +11538,7 @@
                 <w:sz w:val="22"/>
                 <w:szCs w:val="22"/>
               </w:rPr>
-              <w:t xml:space="preserve">Eng. </w:t>
-            </w:r>
-            <w:proofErr w:type="spellStart"/>
-            <w:r>
-              <w:rPr>
-                <w:b/>
-                <w:bCs/>
-                <w:sz w:val="22"/>
-                <w:szCs w:val="22"/>
-              </w:rPr>
-              <w:t>Shadi</w:t>
-            </w:r>
-            <w:proofErr w:type="spellEnd"/>
-            <w:r>
-              <w:rPr>
-                <w:b/>
-                <w:bCs/>
-                <w:sz w:val="22"/>
-                <w:szCs w:val="22"/>
-              </w:rPr>
-              <w:t xml:space="preserve"> Blidi, Eng. Mohammad Amer Khorshid</w:t>
+              <w:t>Eng. Shadi Blidi, Eng. Mohammad Amer Khorshid</w:t>
             </w:r>
           </w:p>
         </w:tc>
@@ -12430,15 +11675,7 @@
         <w:t>Acceptance criteria and Definition of Done.</w:t>
       </w:r>
       <w:r>
-        <w:t xml:space="preserve"> Every backlog item states testable acceptance criteria; an item is done only when its tests pass in continuous integration, another member has reviewed it, its diagrams are </w:t>
-      </w:r>
-      <w:proofErr w:type="gramStart"/>
-      <w:r>
-        <w:t>updated</w:t>
-      </w:r>
-      <w:proofErr w:type="gramEnd"/>
-      <w:r>
-        <w:t xml:space="preserve"> and its report section is written.</w:t>
+        <w:t xml:space="preserve"> Every backlog item states testable acceptance criteria; an item is done only when its tests pass in continuous integration, another member has reviewed it, its diagrams are updated and its report section is written.</w:t>
       </w:r>
     </w:p>
     <w:p>
@@ -12459,15 +11696,7 @@
         <w:t>Automated tests in continuous integration.</w:t>
       </w:r>
       <w:r>
-        <w:t xml:space="preserve"> The Django CI workflow runs the backend tests against a PostgreSQL 15 service on every push and pull request to main and develop. The Flutter CI workflow runs static analysis (flutter analyze) and the widget and unit tests whenever the app changes. At the end of Iteration 0 the backend has 259 test functions (about 330 test cases after </w:t>
-      </w:r>
-      <w:proofErr w:type="spellStart"/>
-      <w:r>
-        <w:t>parametrisation</w:t>
-      </w:r>
-      <w:proofErr w:type="spellEnd"/>
-      <w:r>
-        <w:t>) and the app has 34 tests.</w:t>
+        <w:t xml:space="preserve"> The Django CI workflow runs the backend tests against a PostgreSQL 15 service on every push and pull request to main and develop. The Flutter CI workflow runs static analysis (flutter analyze) and the widget and unit tests whenever the app changes. At the end of Iteration 0 the backend has 259 test functions (about 330 test cases after parametrisation) and the app has 34 tests.</w:t>
       </w:r>
     </w:p>
     <w:p>
@@ -12569,15 +11798,7 @@
         <w:jc w:val="both"/>
       </w:pPr>
       <w:r>
-        <w:t xml:space="preserve">The Product Backlog and the Kanban board are kept in GitHub Projects, linked to the project repository. Each requirement FR-01 to FR-20 is an issue written as a user story with acceptance criteria, together with five technical items: T-1 (the HTTP 409 fix), T-2 (the model evaluation), T-3 (the performance measurement), T-4 (the throttling of the authentication endpoints) and T-5 (the flow-metrics report). The project has custom fields for the </w:t>
-      </w:r>
-      <w:proofErr w:type="spellStart"/>
-      <w:r>
-        <w:t>MoSCoW</w:t>
-      </w:r>
-      <w:proofErr w:type="spellEnd"/>
-      <w:r>
-        <w:t xml:space="preserve"> priority, the requirement ID, the increment (an iteration field with two-week iterations from 2 November 2026) and the status, whose options are the workflow states of Table 2.1. Three views serve different purposes: a backlog table grouped by increment (Figure 2.3), a Kanban board with one column per state and column limits on In Progress and Review (Figure 2.4), and a roadmap of the increments over time. Each increment also has a repository milestone, and the project description states the Definition of Workflow.</w:t>
+        <w:t>The Product Backlog and the Kanban board are kept in GitHub Projects, linked to the project repository. Each requirement FR-01 to FR-20 is an issue written as a user story with acceptance criteria, together with five technical items: T-1 (the HTTP 409 fix), T-2 (the model evaluation), T-3 (the performance measurement), T-4 (the throttling of the authentication endpoints) and T-5 (the flow-metrics report). The project has custom fields for the MoSCoW priority, the requirement ID, the increment (an iteration field with two-week iterations from 2 November 2026) and the status, whose options are the workflow states of Table 2.1. Three views serve different purposes: a backlog table grouped by increment (Figure 2.3), a Kanban board with one column per state and column limits on In Progress and Review (Figure 2.4), and a roadmap of the increments over time. Each increment also has a repository milestone, and the project description states the Definition of Workflow.</w:t>
       </w:r>
     </w:p>
     <w:p>
@@ -12646,6 +11867,9 @@
         <w:jc w:val="center"/>
       </w:pPr>
       <w:r>
+        <w:rPr>
+          <w:noProof/>
+        </w:rPr>
         <w:drawing>
           <wp:inline distT="0" distB="0" distL="0" distR="0" wp14:anchorId="2768FAE8" wp14:editId="71556A37">
             <wp:extent cx="5946846" cy="3345180"/>
@@ -12699,15 +11923,7 @@
         <w:jc w:val="both"/>
       </w:pPr>
       <w:r>
-        <w:t xml:space="preserve">GitHub Projects was preferred over Jira because the issues, the pull requests that implement them and the CI results live in the same place: a requirement links directly to the code and tests that satisfy it, and no second system </w:t>
-      </w:r>
-      <w:proofErr w:type="gramStart"/>
-      <w:r>
-        <w:t>has to</w:t>
-      </w:r>
-      <w:proofErr w:type="gramEnd"/>
-      <w:r>
-        <w:t xml:space="preserve"> be kept in sync by hand. The schedule is maintained as a Gantt chart (Figure 2.2), and a decision log records each project decision with its reason and the rejected alternative.</w:t>
+        <w:t>GitHub Projects was preferred over Jira because the issues, the pull requests that implement them and the CI results live in the same place: a requirement links directly to the code and tests that satisfy it, and no second system has to be kept in sync by hand. The schedule is maintained as a Gantt chart (Figure 2.2), and a decision log records each project decision with its reason and the rejected alternative.</w:t>
       </w:r>
     </w:p>
     <w:p>
@@ -12726,15 +11942,7 @@
         <w:jc w:val="both"/>
       </w:pPr>
       <w:r>
-        <w:t xml:space="preserve">Progress is monitored at three levels. Continuously, the board shows the state of every item, the column limits show when the WIP limit is reached, and the CI result of each pull request shows whether the work meets the Definition of Done. Every two weeks, the review with the supervisors presents the Increment and collects their feedback, the </w:t>
-      </w:r>
-      <w:proofErr w:type="gramStart"/>
-      <w:r>
-        <w:t>four flow</w:t>
-      </w:r>
-      <w:proofErr w:type="gramEnd"/>
-      <w:r>
-        <w:t xml:space="preserve"> metrics are reported (WIP, throughput, work item age and cycle time), and a short workflow review decides which policies the team changes [8]. At the phase level, Seminar 1 and Seminar 2 are external checkpoints where the committee reviews the plan and the results.</w:t>
+        <w:t>Progress is monitored at three levels. Continuously, the board shows the state of every item, the column limits show when the WIP limit is reached, and the CI result of each pull request shows whether the work meets the Definition of Done. Every two weeks, the review with the supervisors presents the Increment and collects their feedback, the four flow metrics are reported (WIP, throughput, work item age and cycle time), and a short workflow review decides which policies the team changes [8]. At the phase level, Seminar 1 and Seminar 2 are external checkpoints where the committee reviews the plan and the results.</w:t>
       </w:r>
     </w:p>
     <w:p>
@@ -12798,23 +12006,7 @@
         <w:jc w:val="both"/>
       </w:pPr>
       <w:r>
-        <w:t xml:space="preserve">Since Graduation Project 1 adds a mobile application to the existing web system, the repository was </w:t>
-      </w:r>
-      <w:proofErr w:type="spellStart"/>
-      <w:r>
-        <w:t>reorganised</w:t>
-      </w:r>
-      <w:proofErr w:type="spellEnd"/>
-      <w:r>
-        <w:t xml:space="preserve"> into a </w:t>
-      </w:r>
-      <w:proofErr w:type="spellStart"/>
-      <w:r>
-        <w:t>monorepo</w:t>
-      </w:r>
-      <w:proofErr w:type="spellEnd"/>
-      <w:r>
-        <w:t xml:space="preserve"> at the start of this phase, so the backend, the app, the diagrams and the documents are versioned together. Table 2.5 lists its main elements.</w:t>
+        <w:t>Since Graduation Project 1 adds a mobile application to the existing web system, the repository was reorganised into a monorepo at the start of this phase, so the backend, the app, the diagrams and the documents are versioned together. Table 2.5 lists its main elements.</w:t>
       </w:r>
     </w:p>
     <w:p>
@@ -12852,12 +12044,6 @@
         <w:gridCol w:w="6773"/>
       </w:tblGrid>
       <w:tr>
-        <w:tblPrEx>
-          <w:tblCellMar>
-            <w:top w:w="0" w:type="dxa"/>
-            <w:bottom w:w="0" w:type="dxa"/>
-          </w:tblCellMar>
-        </w:tblPrEx>
         <w:trPr>
           <w:cantSplit/>
           <w:tblHeader/>
@@ -12931,12 +12117,6 @@
         </w:tc>
       </w:tr>
       <w:tr>
-        <w:tblPrEx>
-          <w:tblCellMar>
-            <w:top w:w="0" w:type="dxa"/>
-            <w:bottom w:w="0" w:type="dxa"/>
-          </w:tblCellMar>
-        </w:tblPrEx>
         <w:trPr>
           <w:cantSplit/>
           <w:jc w:val="center"/>
@@ -13005,12 +12185,6 @@
         </w:tc>
       </w:tr>
       <w:tr>
-        <w:tblPrEx>
-          <w:tblCellMar>
-            <w:top w:w="0" w:type="dxa"/>
-            <w:bottom w:w="0" w:type="dxa"/>
-          </w:tblCellMar>
-        </w:tblPrEx>
         <w:trPr>
           <w:cantSplit/>
           <w:jc w:val="center"/>
@@ -13079,12 +12253,6 @@
         </w:tc>
       </w:tr>
       <w:tr>
-        <w:tblPrEx>
-          <w:tblCellMar>
-            <w:top w:w="0" w:type="dxa"/>
-            <w:bottom w:w="0" w:type="dxa"/>
-          </w:tblCellMar>
-        </w:tblPrEx>
         <w:trPr>
           <w:cantSplit/>
           <w:jc w:val="center"/>
@@ -13153,12 +12321,6 @@
         </w:tc>
       </w:tr>
       <w:tr>
-        <w:tblPrEx>
-          <w:tblCellMar>
-            <w:top w:w="0" w:type="dxa"/>
-            <w:bottom w:w="0" w:type="dxa"/>
-          </w:tblCellMar>
-        </w:tblPrEx>
         <w:trPr>
           <w:cantSplit/>
           <w:jc w:val="center"/>
@@ -13227,12 +12389,6 @@
         </w:tc>
       </w:tr>
       <w:tr>
-        <w:tblPrEx>
-          <w:tblCellMar>
-            <w:top w:w="0" w:type="dxa"/>
-            <w:bottom w:w="0" w:type="dxa"/>
-          </w:tblCellMar>
-        </w:tblPrEx>
         <w:trPr>
           <w:cantSplit/>
           <w:jc w:val="center"/>
@@ -13301,12 +12457,6 @@
         </w:tc>
       </w:tr>
       <w:tr>
-        <w:tblPrEx>
-          <w:tblCellMar>
-            <w:top w:w="0" w:type="dxa"/>
-            <w:bottom w:w="0" w:type="dxa"/>
-          </w:tblCellMar>
-        </w:tblPrEx>
         <w:trPr>
           <w:cantSplit/>
           <w:jc w:val="center"/>
@@ -13339,27 +12489,7 @@
                 <w:sz w:val="22"/>
                 <w:szCs w:val="22"/>
               </w:rPr>
-              <w:t>.</w:t>
-            </w:r>
-            <w:proofErr w:type="spellStart"/>
-            <w:r>
-              <w:rPr>
-                <w:b/>
-                <w:bCs/>
-                <w:sz w:val="22"/>
-                <w:szCs w:val="22"/>
-              </w:rPr>
-              <w:t>github</w:t>
-            </w:r>
-            <w:proofErr w:type="spellEnd"/>
-            <w:r>
-              <w:rPr>
-                <w:b/>
-                <w:bCs/>
-                <w:sz w:val="22"/>
-                <w:szCs w:val="22"/>
-              </w:rPr>
-              <w:t>/workflows/</w:t>
+              <w:t>.github/workflows/</w:t>
             </w:r>
           </w:p>
         </w:tc>
@@ -13395,12 +12525,6 @@
         </w:tc>
       </w:tr>
       <w:tr>
-        <w:tblPrEx>
-          <w:tblCellMar>
-            <w:top w:w="0" w:type="dxa"/>
-            <w:bottom w:w="0" w:type="dxa"/>
-          </w:tblCellMar>
-        </w:tblPrEx>
         <w:trPr>
           <w:cantSplit/>
           <w:jc w:val="center"/>
@@ -13433,19 +12557,8 @@
                 <w:sz w:val="22"/>
                 <w:szCs w:val="22"/>
               </w:rPr>
-              <w:t>docker-</w:t>
-            </w:r>
-            <w:proofErr w:type="spellStart"/>
-            <w:r>
-              <w:rPr>
-                <w:b/>
-                <w:bCs/>
-                <w:sz w:val="22"/>
-                <w:szCs w:val="22"/>
-              </w:rPr>
-              <w:t>compose.yml</w:t>
-            </w:r>
-            <w:proofErr w:type="spellEnd"/>
+              <w:t>docker-compose.yml</w:t>
+            </w:r>
           </w:p>
         </w:tc>
         <w:tc>
@@ -13480,12 +12593,6 @@
         </w:tc>
       </w:tr>
       <w:tr>
-        <w:tblPrEx>
-          <w:tblCellMar>
-            <w:top w:w="0" w:type="dxa"/>
-            <w:bottom w:w="0" w:type="dxa"/>
-          </w:tblCellMar>
-        </w:tblPrEx>
         <w:trPr>
           <w:cantSplit/>
           <w:jc w:val="center"/>
@@ -13613,12 +12720,6 @@
         <w:gridCol w:w="6585"/>
       </w:tblGrid>
       <w:tr>
-        <w:tblPrEx>
-          <w:tblCellMar>
-            <w:top w:w="0" w:type="dxa"/>
-            <w:bottom w:w="0" w:type="dxa"/>
-          </w:tblCellMar>
-        </w:tblPrEx>
         <w:trPr>
           <w:cantSplit/>
           <w:tblHeader/>
@@ -13692,12 +12793,6 @@
         </w:tc>
       </w:tr>
       <w:tr>
-        <w:tblPrEx>
-          <w:tblCellMar>
-            <w:top w:w="0" w:type="dxa"/>
-            <w:bottom w:w="0" w:type="dxa"/>
-          </w:tblCellMar>
-        </w:tblPrEx>
         <w:trPr>
           <w:cantSplit/>
           <w:jc w:val="center"/>
@@ -13766,12 +12861,6 @@
         </w:tc>
       </w:tr>
       <w:tr>
-        <w:tblPrEx>
-          <w:tblCellMar>
-            <w:top w:w="0" w:type="dxa"/>
-            <w:bottom w:w="0" w:type="dxa"/>
-          </w:tblCellMar>
-        </w:tblPrEx>
         <w:trPr>
           <w:cantSplit/>
           <w:jc w:val="center"/>
@@ -13840,12 +12929,6 @@
         </w:tc>
       </w:tr>
       <w:tr>
-        <w:tblPrEx>
-          <w:tblCellMar>
-            <w:top w:w="0" w:type="dxa"/>
-            <w:bottom w:w="0" w:type="dxa"/>
-          </w:tblCellMar>
-        </w:tblPrEx>
         <w:trPr>
           <w:cantSplit/>
           <w:jc w:val="center"/>
@@ -13914,12 +12997,6 @@
         </w:tc>
       </w:tr>
       <w:tr>
-        <w:tblPrEx>
-          <w:tblCellMar>
-            <w:top w:w="0" w:type="dxa"/>
-            <w:bottom w:w="0" w:type="dxa"/>
-          </w:tblCellMar>
-        </w:tblPrEx>
         <w:trPr>
           <w:cantSplit/>
           <w:jc w:val="center"/>
@@ -13988,12 +13065,6 @@
         </w:tc>
       </w:tr>
       <w:tr>
-        <w:tblPrEx>
-          <w:tblCellMar>
-            <w:top w:w="0" w:type="dxa"/>
-            <w:bottom w:w="0" w:type="dxa"/>
-          </w:tblCellMar>
-        </w:tblPrEx>
         <w:trPr>
           <w:cantSplit/>
           <w:jc w:val="center"/>
@@ -14062,12 +13133,6 @@
         </w:tc>
       </w:tr>
       <w:tr>
-        <w:tblPrEx>
-          <w:tblCellMar>
-            <w:top w:w="0" w:type="dxa"/>
-            <w:bottom w:w="0" w:type="dxa"/>
-          </w:tblCellMar>
-        </w:tblPrEx>
         <w:trPr>
           <w:cantSplit/>
           <w:jc w:val="center"/>
@@ -14231,15 +13296,7 @@
         <w:jc w:val="both"/>
       </w:pPr>
       <w:r>
-        <w:t xml:space="preserve">At the weekly replenishment the item moves from Backlog to Ready, with acceptance criteria and a </w:t>
-      </w:r>
-      <w:proofErr w:type="spellStart"/>
-      <w:r>
-        <w:t>MoSCoW</w:t>
-      </w:r>
-      <w:proofErr w:type="spellEnd"/>
-      <w:r>
-        <w:t xml:space="preserve"> priority.</w:t>
+        <w:t>At the weekly replenishment the item moves from Backlog to Ready, with acceptance criteria and a MoSCoW priority.</w:t>
       </w:r>
     </w:p>
     <w:p>
@@ -14296,15 +13353,7 @@
         <w:jc w:val="both"/>
       </w:pPr>
       <w:r>
-        <w:t xml:space="preserve">A member who did not write the change reviews it and the CI workflows run; the pull request is squash-merged only when both </w:t>
-      </w:r>
-      <w:proofErr w:type="gramStart"/>
-      <w:r>
-        <w:t>pass</w:t>
-      </w:r>
-      <w:proofErr w:type="gramEnd"/>
-      <w:r>
-        <w:t>, the branch is deleted and the item moves to Done.</w:t>
+        <w:t>A member who did not write the change reviews it and the CI workflows run; the pull request is squash-merged only when both pass, the branch is deleted and the item moves to Done.</w:t>
       </w:r>
     </w:p>
     <w:p>
@@ -14374,12 +13423,6 @@
         <w:gridCol w:w="6585"/>
       </w:tblGrid>
       <w:tr>
-        <w:tblPrEx>
-          <w:tblCellMar>
-            <w:top w:w="0" w:type="dxa"/>
-            <w:bottom w:w="0" w:type="dxa"/>
-          </w:tblCellMar>
-        </w:tblPrEx>
         <w:trPr>
           <w:cantSplit/>
           <w:tblHeader/>
@@ -14453,12 +13496,6 @@
         </w:tc>
       </w:tr>
       <w:tr>
-        <w:tblPrEx>
-          <w:tblCellMar>
-            <w:top w:w="0" w:type="dxa"/>
-            <w:bottom w:w="0" w:type="dxa"/>
-          </w:tblCellMar>
-        </w:tblPrEx>
         <w:trPr>
           <w:cantSplit/>
           <w:jc w:val="center"/>
@@ -14527,12 +13564,6 @@
         </w:tc>
       </w:tr>
       <w:tr>
-        <w:tblPrEx>
-          <w:tblCellMar>
-            <w:top w:w="0" w:type="dxa"/>
-            <w:bottom w:w="0" w:type="dxa"/>
-          </w:tblCellMar>
-        </w:tblPrEx>
         <w:trPr>
           <w:cantSplit/>
           <w:jc w:val="center"/>
@@ -14601,12 +13632,6 @@
         </w:tc>
       </w:tr>
       <w:tr>
-        <w:tblPrEx>
-          <w:tblCellMar>
-            <w:top w:w="0" w:type="dxa"/>
-            <w:bottom w:w="0" w:type="dxa"/>
-          </w:tblCellMar>
-        </w:tblPrEx>
         <w:trPr>
           <w:cantSplit/>
           <w:jc w:val="center"/>
@@ -14675,12 +13700,6 @@
         </w:tc>
       </w:tr>
       <w:tr>
-        <w:tblPrEx>
-          <w:tblCellMar>
-            <w:top w:w="0" w:type="dxa"/>
-            <w:bottom w:w="0" w:type="dxa"/>
-          </w:tblCellMar>
-        </w:tblPrEx>
         <w:trPr>
           <w:cantSplit/>
           <w:jc w:val="center"/>
@@ -14749,12 +13768,6 @@
         </w:tc>
       </w:tr>
       <w:tr>
-        <w:tblPrEx>
-          <w:tblCellMar>
-            <w:top w:w="0" w:type="dxa"/>
-            <w:bottom w:w="0" w:type="dxa"/>
-          </w:tblCellMar>
-        </w:tblPrEx>
         <w:trPr>
           <w:cantSplit/>
           <w:jc w:val="center"/>
@@ -14823,12 +13836,6 @@
         </w:tc>
       </w:tr>
       <w:tr>
-        <w:tblPrEx>
-          <w:tblCellMar>
-            <w:top w:w="0" w:type="dxa"/>
-            <w:bottom w:w="0" w:type="dxa"/>
-          </w:tblCellMar>
-        </w:tblPrEx>
         <w:trPr>
           <w:cantSplit/>
           <w:jc w:val="center"/>
@@ -14917,39 +13924,7 @@
         <w:jc w:val="both"/>
       </w:pPr>
       <w:r>
-        <w:t>The controlled configuration items are the source code of the backend and the app; the dependency files (backend/requirements.txt, frontend/</w:t>
-      </w:r>
-      <w:proofErr w:type="spellStart"/>
-      <w:r>
-        <w:t>pubspec.yaml</w:t>
-      </w:r>
-      <w:proofErr w:type="spellEnd"/>
-      <w:r>
-        <w:t xml:space="preserve"> and </w:t>
-      </w:r>
-      <w:proofErr w:type="spellStart"/>
-      <w:r>
-        <w:t>pubspec.lock</w:t>
-      </w:r>
-      <w:proofErr w:type="spellEnd"/>
-      <w:r>
-        <w:t>); the database migrations; docker-</w:t>
-      </w:r>
-      <w:proofErr w:type="spellStart"/>
-      <w:r>
-        <w:t>compose.yml</w:t>
-      </w:r>
-      <w:proofErr w:type="spellEnd"/>
-      <w:r>
-        <w:t>; the CI workflow files; the diagram sources; the API contract; and the documentation. Secrets such as the Django secret key, database credentials and model API tokens are never committed: they are read from environment variables, and an .</w:t>
-      </w:r>
-      <w:proofErr w:type="spellStart"/>
-      <w:r>
-        <w:t>env.example</w:t>
-      </w:r>
-      <w:proofErr w:type="spellEnd"/>
-      <w:r>
-        <w:t xml:space="preserve"> file documents the variables without their values.</w:t>
+        <w:t>The controlled configuration items are the source code of the backend and the app; the dependency files (backend/requirements.txt, frontend/pubspec.yaml and pubspec.lock); the database migrations; docker-compose.yml; the CI workflow files; the diagram sources; the API contract; and the documentation. Secrets such as the Django secret key, database credentials and model API tokens are never committed: they are read from environment variables, and an .env.example file documents the variables without their values.</w:t>
       </w:r>
     </w:p>
     <w:p>
@@ -14999,15 +13974,7 @@
         <w:jc w:val="both"/>
       </w:pPr>
       <w:r>
-        <w:t xml:space="preserve">The review covers two strands that match the two core problems of the project: the quality of online survey data, and the automatic analysis of the sentiment of Arabic and English text. Nine studies from 2021 to 2025 were selected because each one measures something that a design decision in this project depends on. Table 3.1 </w:t>
-      </w:r>
-      <w:proofErr w:type="spellStart"/>
-      <w:r>
-        <w:t>summarises</w:t>
-      </w:r>
-      <w:proofErr w:type="spellEnd"/>
-      <w:r>
-        <w:t xml:space="preserve"> them.</w:t>
+        <w:t>The review covers two strands that match the two core problems of the project: the quality of online survey data, and the automatic analysis of the sentiment of Arabic and English text. Nine studies from 2021 to 2025 were selected because each one measures something that a design decision in this project depends on. Table 3.1 summarises them.</w:t>
       </w:r>
     </w:p>
     <w:p>
@@ -15022,34 +13989,13 @@
         <w:t>Data quality of online respondents.</w:t>
       </w:r>
       <w:r>
-        <w:t xml:space="preserve"> Peer et al. compared online platforms and panels and found that the share of participants who passed both attention checks ranged from 68.7% on Prolific to 22.1% on </w:t>
-      </w:r>
-      <w:proofErr w:type="spellStart"/>
-      <w:r>
-        <w:t>Dynata</w:t>
-      </w:r>
-      <w:proofErr w:type="spellEnd"/>
-      <w:r>
-        <w:t xml:space="preserve">; how often and </w:t>
-      </w:r>
-      <w:proofErr w:type="spellStart"/>
+        <w:t xml:space="preserve"> Peer et al. compared online platforms and panels and found that the share of participants who passed both attention checks ranged from 68.7% on Prolific to 22.1% on Dynata; how often and </w:t>
+      </w:r>
       <w:r>
         <w:t>a</w:t>
       </w:r>
       <w:r>
-        <w:t>why</w:t>
-      </w:r>
-      <w:proofErr w:type="spellEnd"/>
-      <w:r>
-        <w:t xml:space="preserve"> participants used a platform predicted data quality better than their approval ratings [20]. Three of the five authors are affiliated with Prolific, which the reader should keep in mind. Douglas et al. compared five sources and found that Prolific and </w:t>
-      </w:r>
-      <w:proofErr w:type="spellStart"/>
-      <w:r>
-        <w:t>CloudResearch</w:t>
-      </w:r>
-      <w:proofErr w:type="spellEnd"/>
-      <w:r>
-        <w:t xml:space="preserve"> participants were more likely to pass attention checks, give meaningful answers, follow instructions, have unique IP addresses and locations, and work slowly enough to read the items; among the paid sources, the cost per high-quality respondent ranged from USD 1.90 on Prolific to USD 8.17 on Qualtrics panels [21]. Ward and Meade reviewed how to prevent, identify, report and remove careless responses, and proposed screening recommendations at several levels of strictness [22].</w:t>
+        <w:t>why participants used a platform predicted data quality better than their approval ratings [20]. Three of the five authors are affiliated with Prolific, which the reader should keep in mind. Douglas et al. compared five sources and found that Prolific and CloudResearch participants were more likely to pass attention checks, give meaningful answers, follow instructions, have unique IP addresses and locations, and work slowly enough to read the items; among the paid sources, the cost per high-quality respondent ranged from USD 1.90 on Prolific to USD 8.17 on Qualtrics panels [21]. Ward and Meade reviewed how to prevent, identify, report and remove careless responses, and proposed screening recommendations at several levels of strictness [22].</w:t>
       </w:r>
     </w:p>
     <w:p>
@@ -15064,23 +14010,7 @@
         <w:t>The arrival of AI respondents.</w:t>
       </w:r>
       <w:r>
-        <w:t xml:space="preserve"> Westwood built an autonomous agent that passed 99.8% of attention checks across 43,000 tests and was not identified by the detection methods he tested; each fake response cost about </w:t>
-      </w:r>
-      <w:proofErr w:type="gramStart"/>
-      <w:r>
-        <w:t>USD 0.05, and</w:t>
-      </w:r>
-      <w:proofErr w:type="gramEnd"/>
-      <w:r>
-        <w:t xml:space="preserve"> adding 10 to 52 such responses would have flipped the predicted outcome of seven national polls before the 2024 United States election [23]. Zhang, Xu and </w:t>
-      </w:r>
-      <w:proofErr w:type="spellStart"/>
-      <w:r>
-        <w:t>Alvero</w:t>
-      </w:r>
-      <w:proofErr w:type="spellEnd"/>
-      <w:r>
-        <w:t xml:space="preserve"> found that 34% of participants recruited from an online platform reported using large language models to help answer open-ended questions, and that text written by these models was more homogeneous and more positive than human answers, especially for sensitive questions about social groups [24]. For this project, the second finding matters directly: AI-assisted answers can shift sentiment results towards positive.</w:t>
+        <w:t xml:space="preserve"> Westwood built an autonomous agent that passed 99.8% of attention checks across 43,000 tests and was not identified by the detection methods he tested; each fake response cost about USD 0.05, and adding 10 to 52 such responses would have flipped the predicted outcome of seven national polls before the 2024 United States election [23]. Zhang, Xu and Alvero found that 34% of participants recruited from an online platform reported using large language models to help answer open-ended questions, and that text written by these models was more homogeneous and more positive than human answers, especially for sensitive questions about social groups [24]. For this project, the second finding matters directly: AI-assisted answers can shift sentiment results towards positive.</w:t>
       </w:r>
     </w:p>
     <w:p>
@@ -15095,48 +14025,11 @@
         <w:t>Arabic sentiment analysis.</w:t>
       </w:r>
       <w:r>
-        <w:t xml:space="preserve"> Abu Farha and Magdy benchmarked 24 transformer models on Arabic sentiment in dialectal tweets; MARBERT and </w:t>
-      </w:r>
-      <w:proofErr w:type="spellStart"/>
-      <w:r>
-        <w:t>AraBERT</w:t>
-      </w:r>
-      <w:proofErr w:type="spellEnd"/>
-      <w:r>
-        <w:t>-large reached the best F1-PN of 0.724, against 0.625 for multilingual BERT [25]. Al-</w:t>
-      </w:r>
-      <w:proofErr w:type="spellStart"/>
-      <w:r>
-        <w:t>Thubaity</w:t>
-      </w:r>
-      <w:proofErr w:type="spellEnd"/>
-      <w:r>
-        <w:t xml:space="preserve"> et al. found that GPT-4 outperformed GPT-3.5 and Bard on dialectal Arabic sentiment and came close to a fully supervised Arabic BERT model [26]. </w:t>
-      </w:r>
-      <w:proofErr w:type="spellStart"/>
-      <w:r>
-        <w:t>Khondaker</w:t>
-      </w:r>
-      <w:proofErr w:type="spellEnd"/>
-      <w:r>
-        <w:t xml:space="preserve"> et al. evaluated ChatGPT on 44 Arabic tasks across more than 60 datasets and found it consistently surpassed by smaller models fine-tuned on Arabic, with weaker results on dialects than on MSA [27]. Finally, </w:t>
-      </w:r>
-      <w:proofErr w:type="spellStart"/>
-      <w:r>
-        <w:t>Lossio</w:t>
-      </w:r>
-      <w:proofErr w:type="spellEnd"/>
-      <w:r>
-        <w:t xml:space="preserve">-Ventura et al. compared methods on real open-ended survey answers in English: lexicon-based tools reached 0.43–0.66 accuracy, a tweet-trained </w:t>
-      </w:r>
-      <w:proofErr w:type="spellStart"/>
+        <w:t xml:space="preserve"> Abu Farha and Magdy benchmarked 24 transformer models on Arabic sentiment in dialectal tweets; MARBERT and AraBERT-large reached the best F1-PN of 0.724, against 0.625 for multilingual BERT [25]. Al-Thubaity et al. found that GPT-4 outperformed GPT-3.5 and Bard on dialectal Arabic sentiment and came close to a fully supervised Arabic BERT model [26]. Khondaker et al. evaluated ChatGPT on 44 Arabic tasks across more than 60 datasets and found it consistently surpassed by smaller models fine-tuned on Arabic, with weaker results on dialects than on MSA [27]. Finally, Lossio-Ventura et al. compared methods on real open-ended survey answers in English: lexicon-based tools reached 0.43–0.66 accuracy, a tweet-trained </w:t>
+      </w:r>
       <w:r>
         <w:lastRenderedPageBreak/>
-        <w:t>RoBERTa</w:t>
-      </w:r>
-      <w:proofErr w:type="spellEnd"/>
-      <w:r>
-        <w:t xml:space="preserve"> model 0.72–0.78, and ChatGPT 0.86–0.87, and the authors recommend validating any tool against human labels [28].</w:t>
+        <w:t>RoBERTa model 0.72–0.78, and ChatGPT 0.86–0.87, and the authors recommend validating any tool against human labels [28].</w:t>
       </w:r>
     </w:p>
     <w:p>
@@ -15144,15 +14037,7 @@
         <w:jc w:val="both"/>
       </w:pPr>
       <w:r>
-        <w:t xml:space="preserve">Together the studies show that data quality varies widely between respondent sources and </w:t>
-      </w:r>
-      <w:proofErr w:type="gramStart"/>
-      <w:r>
-        <w:t>has to</w:t>
-      </w:r>
-      <w:proofErr w:type="gramEnd"/>
-      <w:r>
-        <w:t xml:space="preserve"> be measured, that single checks are no longer sufficient, and that for Arabic sentiment a fine-tuned Arabic model remains a strong and cheap option while large language models are competitive and improving. None of the studies provides a platform that serves Syrian respondents, and only one evaluates sentiment methods on survey answers, in English.</w:t>
+        <w:t>Together the studies show that data quality varies widely between respondent sources and has to be measured, that single checks are no longer sufficient, and that for Arabic sentiment a fine-tuned Arabic model remains a strong and cheap option while large language models are competitive and improving. None of the studies provides a platform that serves Syrian respondents, and only one evaluates sentiment methods on survey answers, in English.</w:t>
       </w:r>
     </w:p>
     <w:p>
@@ -15192,12 +14077,6 @@
         <w:gridCol w:w="2258"/>
       </w:tblGrid>
       <w:tr>
-        <w:tblPrEx>
-          <w:tblCellMar>
-            <w:top w:w="0" w:type="dxa"/>
-            <w:bottom w:w="0" w:type="dxa"/>
-          </w:tblCellMar>
-        </w:tblPrEx>
         <w:trPr>
           <w:cantSplit/>
           <w:tblHeader/>
@@ -15337,12 +14216,6 @@
         </w:tc>
       </w:tr>
       <w:tr>
-        <w:tblPrEx>
-          <w:tblCellMar>
-            <w:top w:w="0" w:type="dxa"/>
-            <w:bottom w:w="0" w:type="dxa"/>
-          </w:tblCellMar>
-        </w:tblPrEx>
         <w:trPr>
           <w:cantSplit/>
           <w:jc w:val="center"/>
@@ -15469,12 +14342,6 @@
         </w:tc>
       </w:tr>
       <w:tr>
-        <w:tblPrEx>
-          <w:tblCellMar>
-            <w:top w:w="0" w:type="dxa"/>
-            <w:bottom w:w="0" w:type="dxa"/>
-          </w:tblCellMar>
-        </w:tblPrEx>
         <w:trPr>
           <w:cantSplit/>
           <w:jc w:val="center"/>
@@ -15601,12 +14468,6 @@
         </w:tc>
       </w:tr>
       <w:tr>
-        <w:tblPrEx>
-          <w:tblCellMar>
-            <w:top w:w="0" w:type="dxa"/>
-            <w:bottom w:w="0" w:type="dxa"/>
-          </w:tblCellMar>
-        </w:tblPrEx>
         <w:trPr>
           <w:cantSplit/>
           <w:jc w:val="center"/>
@@ -15733,12 +14594,6 @@
         </w:tc>
       </w:tr>
       <w:tr>
-        <w:tblPrEx>
-          <w:tblCellMar>
-            <w:top w:w="0" w:type="dxa"/>
-            <w:bottom w:w="0" w:type="dxa"/>
-          </w:tblCellMar>
-        </w:tblPrEx>
         <w:trPr>
           <w:cantSplit/>
           <w:jc w:val="center"/>
@@ -15859,34 +14714,12 @@
                 <w:sz w:val="22"/>
                 <w:szCs w:val="22"/>
               </w:rPr>
-              <w:t xml:space="preserve">Shows the threat; no platform-level </w:t>
-            </w:r>
-            <w:proofErr w:type="spellStart"/>
-            <w:r>
-              <w:rPr>
-                <w:sz w:val="22"/>
-                <w:szCs w:val="22"/>
-              </w:rPr>
-              <w:t>defence</w:t>
-            </w:r>
-            <w:proofErr w:type="spellEnd"/>
-            <w:r>
-              <w:rPr>
-                <w:sz w:val="22"/>
-                <w:szCs w:val="22"/>
-              </w:rPr>
-              <w:t xml:space="preserve"> evaluated.</w:t>
+              <w:t>Shows the threat; no platform-level defence evaluated.</w:t>
             </w:r>
           </w:p>
         </w:tc>
       </w:tr>
       <w:tr>
-        <w:tblPrEx>
-          <w:tblCellMar>
-            <w:top w:w="0" w:type="dxa"/>
-            <w:bottom w:w="0" w:type="dxa"/>
-          </w:tblCellMar>
-        </w:tblPrEx>
         <w:trPr>
           <w:cantSplit/>
           <w:jc w:val="center"/>
@@ -15917,23 +14750,7 @@
                 <w:sz w:val="22"/>
                 <w:szCs w:val="22"/>
               </w:rPr>
-              <w:t xml:space="preserve">Zhang, Xu &amp; </w:t>
-            </w:r>
-            <w:proofErr w:type="spellStart"/>
-            <w:r>
-              <w:rPr>
-                <w:sz w:val="22"/>
-                <w:szCs w:val="22"/>
-              </w:rPr>
-              <w:t>Alvero</w:t>
-            </w:r>
-            <w:proofErr w:type="spellEnd"/>
-            <w:r>
-              <w:rPr>
-                <w:sz w:val="22"/>
-                <w:szCs w:val="22"/>
-              </w:rPr>
-              <w:t>, 2025 [24]</w:t>
+              <w:t>Zhang, Xu &amp; Alvero, 2025 [24]</w:t>
             </w:r>
           </w:p>
         </w:tc>
@@ -16029,12 +14846,6 @@
         </w:tc>
       </w:tr>
       <w:tr>
-        <w:tblPrEx>
-          <w:tblCellMar>
-            <w:top w:w="0" w:type="dxa"/>
-            <w:bottom w:w="0" w:type="dxa"/>
-          </w:tblCellMar>
-        </w:tblPrEx>
         <w:trPr>
           <w:cantSplit/>
           <w:jc w:val="center"/>
@@ -16125,23 +14936,7 @@
                 <w:sz w:val="22"/>
                 <w:szCs w:val="22"/>
               </w:rPr>
-              <w:t xml:space="preserve">24 models compared; best F1-PN 0.724 (MARBERT, </w:t>
-            </w:r>
-            <w:proofErr w:type="spellStart"/>
-            <w:r>
-              <w:rPr>
-                <w:sz w:val="22"/>
-                <w:szCs w:val="22"/>
-              </w:rPr>
-              <w:t>AraBERT</w:t>
-            </w:r>
-            <w:proofErr w:type="spellEnd"/>
-            <w:r>
-              <w:rPr>
-                <w:sz w:val="22"/>
-                <w:szCs w:val="22"/>
-              </w:rPr>
-              <w:t>-large).</w:t>
+              <w:t>24 models compared; best F1-PN 0.724 (MARBERT, AraBERT-large).</w:t>
             </w:r>
           </w:p>
         </w:tc>
@@ -16177,12 +14972,6 @@
         </w:tc>
       </w:tr>
       <w:tr>
-        <w:tblPrEx>
-          <w:tblCellMar>
-            <w:top w:w="0" w:type="dxa"/>
-            <w:bottom w:w="0" w:type="dxa"/>
-          </w:tblCellMar>
-        </w:tblPrEx>
         <w:trPr>
           <w:cantSplit/>
           <w:jc w:val="center"/>
@@ -16213,23 +15002,7 @@
                 <w:sz w:val="22"/>
                 <w:szCs w:val="22"/>
               </w:rPr>
-              <w:t>Al-</w:t>
-            </w:r>
-            <w:proofErr w:type="spellStart"/>
-            <w:r>
-              <w:rPr>
-                <w:sz w:val="22"/>
-                <w:szCs w:val="22"/>
-              </w:rPr>
-              <w:t>Thubaity</w:t>
-            </w:r>
-            <w:proofErr w:type="spellEnd"/>
-            <w:r>
-              <w:rPr>
-                <w:sz w:val="22"/>
-                <w:szCs w:val="22"/>
-              </w:rPr>
-              <w:t xml:space="preserve"> et al., 2023 [26]</w:t>
+              <w:t>Al-Thubaity et al., 2023 [26]</w:t>
             </w:r>
           </w:p>
         </w:tc>
@@ -16325,12 +15098,6 @@
         </w:tc>
       </w:tr>
       <w:tr>
-        <w:tblPrEx>
-          <w:tblCellMar>
-            <w:top w:w="0" w:type="dxa"/>
-            <w:bottom w:w="0" w:type="dxa"/>
-          </w:tblCellMar>
-        </w:tblPrEx>
         <w:trPr>
           <w:cantSplit/>
           <w:jc w:val="center"/>
@@ -16356,21 +15123,12 @@
             <w:pPr>
               <w:spacing w:after="0" w:line="240" w:lineRule="auto"/>
             </w:pPr>
-            <w:proofErr w:type="spellStart"/>
-            <w:r>
-              <w:rPr>
-                <w:sz w:val="22"/>
-                <w:szCs w:val="22"/>
-              </w:rPr>
-              <w:t>Khondaker</w:t>
-            </w:r>
-            <w:proofErr w:type="spellEnd"/>
-            <w:r>
-              <w:rPr>
-                <w:sz w:val="22"/>
-                <w:szCs w:val="22"/>
-              </w:rPr>
-              <w:t xml:space="preserve"> et al., 2023 [27]</w:t>
+            <w:r>
+              <w:rPr>
+                <w:sz w:val="22"/>
+                <w:szCs w:val="22"/>
+              </w:rPr>
+              <w:t>Khondaker et al., 2023 [27]</w:t>
             </w:r>
           </w:p>
         </w:tc>
@@ -16466,12 +15224,6 @@
         </w:tc>
       </w:tr>
       <w:tr>
-        <w:tblPrEx>
-          <w:tblCellMar>
-            <w:top w:w="0" w:type="dxa"/>
-            <w:bottom w:w="0" w:type="dxa"/>
-          </w:tblCellMar>
-        </w:tblPrEx>
         <w:trPr>
           <w:cantSplit/>
           <w:jc w:val="center"/>
@@ -16497,21 +15249,12 @@
             <w:pPr>
               <w:spacing w:after="0" w:line="240" w:lineRule="auto"/>
             </w:pPr>
-            <w:proofErr w:type="spellStart"/>
-            <w:r>
-              <w:rPr>
-                <w:sz w:val="22"/>
-                <w:szCs w:val="22"/>
-              </w:rPr>
-              <w:t>Lossio</w:t>
-            </w:r>
-            <w:proofErr w:type="spellEnd"/>
-            <w:r>
-              <w:rPr>
-                <w:sz w:val="22"/>
-                <w:szCs w:val="22"/>
-              </w:rPr>
-              <w:t>-Ventura et al., 2024 [28]</w:t>
+            <w:r>
+              <w:rPr>
+                <w:sz w:val="22"/>
+                <w:szCs w:val="22"/>
+              </w:rPr>
+              <w:t>Lossio-Ventura et al., 2024 [28]</w:t>
             </w:r>
           </w:p>
         </w:tc>
@@ -16571,23 +15314,7 @@
                 <w:sz w:val="22"/>
                 <w:szCs w:val="22"/>
               </w:rPr>
-              <w:t xml:space="preserve">Lexicons 0.43–0.66, </w:t>
-            </w:r>
-            <w:proofErr w:type="spellStart"/>
-            <w:r>
-              <w:rPr>
-                <w:sz w:val="22"/>
-                <w:szCs w:val="22"/>
-              </w:rPr>
-              <w:t>RoBERTa</w:t>
-            </w:r>
-            <w:proofErr w:type="spellEnd"/>
-            <w:r>
-              <w:rPr>
-                <w:sz w:val="22"/>
-                <w:szCs w:val="22"/>
-              </w:rPr>
-              <w:t xml:space="preserve"> 0.72–0.78, ChatGPT 0.86–0.87 accuracy.</w:t>
+              <w:t>Lexicons 0.43–0.66, RoBERTa 0.72–0.78, ChatGPT 0.86–0.87 accuracy.</w:t>
             </w:r>
           </w:p>
         </w:tc>
@@ -16683,12 +15410,6 @@
         <w:gridCol w:w="4140"/>
       </w:tblGrid>
       <w:tr>
-        <w:tblPrEx>
-          <w:tblCellMar>
-            <w:top w:w="0" w:type="dxa"/>
-            <w:bottom w:w="0" w:type="dxa"/>
-          </w:tblCellMar>
-        </w:tblPrEx>
         <w:trPr>
           <w:cantSplit/>
           <w:tblHeader/>
@@ -16795,12 +15516,6 @@
         </w:tc>
       </w:tr>
       <w:tr>
-        <w:tblPrEx>
-          <w:tblCellMar>
-            <w:top w:w="0" w:type="dxa"/>
-            <w:bottom w:w="0" w:type="dxa"/>
-          </w:tblCellMar>
-        </w:tblPrEx>
         <w:trPr>
           <w:cantSplit/>
           <w:jc w:val="center"/>
@@ -16899,12 +15614,6 @@
         </w:tc>
       </w:tr>
       <w:tr>
-        <w:tblPrEx>
-          <w:tblCellMar>
-            <w:top w:w="0" w:type="dxa"/>
-            <w:bottom w:w="0" w:type="dxa"/>
-          </w:tblCellMar>
-        </w:tblPrEx>
         <w:trPr>
           <w:cantSplit/>
           <w:jc w:val="center"/>
@@ -16967,23 +15676,7 @@
                 <w:sz w:val="22"/>
                 <w:szCs w:val="22"/>
               </w:rPr>
-              <w:t>JSON API at /</w:t>
-            </w:r>
-            <w:proofErr w:type="spellStart"/>
-            <w:r>
-              <w:rPr>
-                <w:sz w:val="22"/>
-                <w:szCs w:val="22"/>
-              </w:rPr>
-              <w:t>api</w:t>
-            </w:r>
-            <w:proofErr w:type="spellEnd"/>
-            <w:r>
-              <w:rPr>
-                <w:sz w:val="22"/>
-                <w:szCs w:val="22"/>
-              </w:rPr>
-              <w:t>/v1/ for the respondent app.</w:t>
+              <w:t>JSON API at /api/v1/ for the respondent app.</w:t>
             </w:r>
           </w:p>
         </w:tc>
@@ -17019,12 +15712,6 @@
         </w:tc>
       </w:tr>
       <w:tr>
-        <w:tblPrEx>
-          <w:tblCellMar>
-            <w:top w:w="0" w:type="dxa"/>
-            <w:bottom w:w="0" w:type="dxa"/>
-          </w:tblCellMar>
-        </w:tblPrEx>
         <w:trPr>
           <w:cantSplit/>
           <w:jc w:val="center"/>
@@ -17123,12 +15810,6 @@
         </w:tc>
       </w:tr>
       <w:tr>
-        <w:tblPrEx>
-          <w:tblCellMar>
-            <w:top w:w="0" w:type="dxa"/>
-            <w:bottom w:w="0" w:type="dxa"/>
-          </w:tblCellMar>
-        </w:tblPrEx>
         <w:trPr>
           <w:cantSplit/>
           <w:jc w:val="center"/>
@@ -17221,34 +15902,12 @@
                 <w:sz w:val="22"/>
                 <w:szCs w:val="22"/>
               </w:rPr>
-              <w:t xml:space="preserve">Constraints enforce data integrity (for example one response per respondent per survey); one </w:t>
-            </w:r>
-            <w:proofErr w:type="gramStart"/>
-            <w:r>
-              <w:rPr>
-                <w:sz w:val="22"/>
-                <w:szCs w:val="22"/>
-              </w:rPr>
-              <w:t>compose</w:t>
-            </w:r>
-            <w:proofErr w:type="gramEnd"/>
-            <w:r>
-              <w:rPr>
-                <w:sz w:val="22"/>
-                <w:szCs w:val="22"/>
-              </w:rPr>
-              <w:t xml:space="preserve"> file for every developer.</w:t>
+              <w:t>Constraints enforce data integrity (for example one response per respondent per survey); one compose file for every developer.</w:t>
             </w:r>
           </w:p>
         </w:tc>
       </w:tr>
       <w:tr>
-        <w:tblPrEx>
-          <w:tblCellMar>
-            <w:top w:w="0" w:type="dxa"/>
-            <w:bottom w:w="0" w:type="dxa"/>
-          </w:tblCellMar>
-        </w:tblPrEx>
         <w:trPr>
           <w:cantSplit/>
           <w:jc w:val="center"/>
@@ -17341,50 +16000,12 @@
                 <w:sz w:val="22"/>
                 <w:szCs w:val="22"/>
               </w:rPr>
-              <w:t xml:space="preserve">Arabic models such as </w:t>
-            </w:r>
-            <w:proofErr w:type="spellStart"/>
-            <w:r>
-              <w:rPr>
-                <w:sz w:val="22"/>
-                <w:szCs w:val="22"/>
-              </w:rPr>
-              <w:t>AraBERT</w:t>
-            </w:r>
-            <w:proofErr w:type="spellEnd"/>
-            <w:r>
-              <w:rPr>
-                <w:sz w:val="22"/>
-                <w:szCs w:val="22"/>
-              </w:rPr>
-              <w:t xml:space="preserve"> [31], </w:t>
-            </w:r>
-            <w:proofErr w:type="spellStart"/>
-            <w:r>
-              <w:rPr>
-                <w:sz w:val="22"/>
-                <w:szCs w:val="22"/>
-              </w:rPr>
-              <w:t>CAMeLBERT</w:t>
-            </w:r>
-            <w:proofErr w:type="spellEnd"/>
-            <w:r>
-              <w:rPr>
-                <w:sz w:val="22"/>
-                <w:szCs w:val="22"/>
-              </w:rPr>
-              <w:t xml:space="preserve"> [32] and MARBERT [33], built on BERT [34], reach strong Arabic sentiment results without training by the team.</w:t>
+              <w:t>Arabic models such as AraBERT [31], CAMeLBERT [32] and MARBERT [33], built on BERT [34], reach strong Arabic sentiment results without training by the team.</w:t>
             </w:r>
           </w:p>
         </w:tc>
       </w:tr>
       <w:tr>
-        <w:tblPrEx>
-          <w:tblCellMar>
-            <w:top w:w="0" w:type="dxa"/>
-            <w:bottom w:w="0" w:type="dxa"/>
-          </w:tblCellMar>
-        </w:tblPrEx>
         <w:trPr>
           <w:cantSplit/>
           <w:jc w:val="center"/>
@@ -17483,12 +16104,6 @@
         </w:tc>
       </w:tr>
       <w:tr>
-        <w:tblPrEx>
-          <w:tblCellMar>
-            <w:top w:w="0" w:type="dxa"/>
-            <w:bottom w:w="0" w:type="dxa"/>
-          </w:tblCellMar>
-        </w:tblPrEx>
         <w:trPr>
           <w:cantSplit/>
           <w:jc w:val="center"/>
@@ -17597,23 +16212,7 @@
         <w:jc w:val="both"/>
       </w:pPr>
       <w:r>
-        <w:t xml:space="preserve">For Arabic text, the key result for model choice is that the closeness of the pre-training data to the target text matters more than the size of the pre-training corpus: </w:t>
-      </w:r>
-      <w:proofErr w:type="spellStart"/>
-      <w:r>
-        <w:t>CAMeLBERT</w:t>
-      </w:r>
-      <w:proofErr w:type="spellEnd"/>
-      <w:r>
-        <w:t xml:space="preserve"> trained on MSA reached 93.0 F1-PN on the </w:t>
-      </w:r>
-      <w:proofErr w:type="spellStart"/>
-      <w:r>
-        <w:t>ArSAS</w:t>
-      </w:r>
-      <w:proofErr w:type="spellEnd"/>
-      <w:r>
-        <w:t xml:space="preserve"> dataset, against 88.4 for multilingual BERT [32]. Since the project analyses MSA and English, MSA-pretrained and multilingual models are both candidates, and the comparison in Increment 2 (T-2) decides between them.</w:t>
+        <w:t>For Arabic text, the key result for model choice is that the closeness of the pre-training data to the target text matters more than the size of the pre-training corpus: CAMeLBERT trained on MSA reached 93.0 F1-PN on the ArSAS dataset, against 88.4 for multilingual BERT [32]. Since the project analyses MSA and English, MSA-pretrained and multilingual models are both candidates, and the comparison in Increment 2 (T-2) decides between them.</w:t>
       </w:r>
     </w:p>
     <w:p>
@@ -17631,23 +16230,7 @@
         <w:jc w:val="both"/>
       </w:pPr>
       <w:r>
-        <w:t xml:space="preserve">Six platforms were compared on the three capabilities that define Smart Survey: targeting respondents by profile, checking response quality, and </w:t>
-      </w:r>
-      <w:proofErr w:type="spellStart"/>
-      <w:r>
-        <w:t>analysing</w:t>
-      </w:r>
-      <w:proofErr w:type="spellEnd"/>
-      <w:r>
-        <w:t xml:space="preserve"> the sentiment of open answers. Three are survey builders, where the owner brings the respondents, and three are panels, which sell access to profiled respondents. Table 3.3 </w:t>
-      </w:r>
-      <w:proofErr w:type="spellStart"/>
-      <w:r>
-        <w:t>summarises</w:t>
-      </w:r>
-      <w:proofErr w:type="spellEnd"/>
-      <w:r>
-        <w:t xml:space="preserve"> the comparison. Facts were taken from the platforms' official help pages between 23 and 27 October 2026; "not stated" means that the pages read do not state the feature, not that the feature is certainly missing.</w:t>
+        <w:t>Six platforms were compared on the three capabilities that define Smart Survey: targeting respondents by profile, checking response quality, and analysing the sentiment of open answers. Three are survey builders, where the owner brings the respondents, and three are panels, which sell access to profiled respondents. Table 3.3 summarises the comparison. Facts were taken from the platforms' official help pages between 23 and 27 October 2026; "not stated" means that the pages read do not state the feature, not that the feature is certainly missing.</w:t>
       </w:r>
     </w:p>
     <w:p>
@@ -17690,12 +16273,6 @@
         <w:gridCol w:w="1412"/>
       </w:tblGrid>
       <w:tr>
-        <w:tblPrEx>
-          <w:tblCellMar>
-            <w:top w:w="0" w:type="dxa"/>
-            <w:bottom w:w="0" w:type="dxa"/>
-          </w:tblCellMar>
-        </w:tblPrEx>
         <w:trPr>
           <w:cantSplit/>
           <w:tblHeader/>
@@ -17901,12 +16478,6 @@
         </w:tc>
       </w:tr>
       <w:tr>
-        <w:tblPrEx>
-          <w:tblCellMar>
-            <w:top w:w="0" w:type="dxa"/>
-            <w:bottom w:w="0" w:type="dxa"/>
-          </w:tblCellMar>
-        </w:tblPrEx>
         <w:trPr>
           <w:cantSplit/>
           <w:jc w:val="center"/>
@@ -18093,12 +16664,6 @@
         </w:tc>
       </w:tr>
       <w:tr>
-        <w:tblPrEx>
-          <w:tblCellMar>
-            <w:top w:w="0" w:type="dxa"/>
-            <w:bottom w:w="0" w:type="dxa"/>
-          </w:tblCellMar>
-        </w:tblPrEx>
         <w:trPr>
           <w:cantSplit/>
           <w:jc w:val="center"/>
@@ -18124,7 +16689,6 @@
             <w:pPr>
               <w:spacing w:after="0" w:line="240" w:lineRule="auto"/>
             </w:pPr>
-            <w:proofErr w:type="spellStart"/>
             <w:r>
               <w:rPr>
                 <w:sz w:val="22"/>
@@ -18132,7 +16696,6 @@
               </w:rPr>
               <w:t>Typeform</w:t>
             </w:r>
-            <w:proofErr w:type="spellEnd"/>
           </w:p>
         </w:tc>
         <w:tc>
@@ -18287,12 +16850,6 @@
         </w:tc>
       </w:tr>
       <w:tr>
-        <w:tblPrEx>
-          <w:tblCellMar>
-            <w:top w:w="0" w:type="dxa"/>
-            <w:bottom w:w="0" w:type="dxa"/>
-          </w:tblCellMar>
-        </w:tblPrEx>
         <w:trPr>
           <w:cantSplit/>
           <w:jc w:val="center"/>
@@ -18443,23 +17000,7 @@
                 <w:sz w:val="22"/>
                 <w:szCs w:val="22"/>
               </w:rPr>
-              <w:t xml:space="preserve">On some paid </w:t>
-            </w:r>
-            <w:proofErr w:type="gramStart"/>
-            <w:r>
-              <w:rPr>
-                <w:sz w:val="22"/>
-                <w:szCs w:val="22"/>
-              </w:rPr>
-              <w:t>plans;</w:t>
-            </w:r>
-            <w:proofErr w:type="gramEnd"/>
-            <w:r>
-              <w:rPr>
-                <w:sz w:val="22"/>
-                <w:szCs w:val="22"/>
-              </w:rPr>
-              <w:t xml:space="preserve"> languages not stated [6]</w:t>
+              <w:t>On some paid plans; languages not stated [6]</w:t>
             </w:r>
           </w:p>
         </w:tc>
@@ -18495,12 +17036,6 @@
         </w:tc>
       </w:tr>
       <w:tr>
-        <w:tblPrEx>
-          <w:tblCellMar>
-            <w:top w:w="0" w:type="dxa"/>
-            <w:bottom w:w="0" w:type="dxa"/>
-          </w:tblCellMar>
-        </w:tblPrEx>
         <w:trPr>
           <w:cantSplit/>
           <w:jc w:val="center"/>
@@ -18687,12 +17222,6 @@
         </w:tc>
       </w:tr>
       <w:tr>
-        <w:tblPrEx>
-          <w:tblCellMar>
-            <w:top w:w="0" w:type="dxa"/>
-            <w:bottom w:w="0" w:type="dxa"/>
-          </w:tblCellMar>
-        </w:tblPrEx>
         <w:trPr>
           <w:cantSplit/>
           <w:jc w:val="center"/>
@@ -18879,12 +17408,6 @@
         </w:tc>
       </w:tr>
       <w:tr>
-        <w:tblPrEx>
-          <w:tblCellMar>
-            <w:top w:w="0" w:type="dxa"/>
-            <w:bottom w:w="0" w:type="dxa"/>
-          </w:tblCellMar>
-        </w:tblPrEx>
         <w:trPr>
           <w:cantSplit/>
           <w:jc w:val="center"/>
@@ -18910,7 +17433,6 @@
             <w:pPr>
               <w:spacing w:after="0" w:line="240" w:lineRule="auto"/>
             </w:pPr>
-            <w:proofErr w:type="spellStart"/>
             <w:r>
               <w:rPr>
                 <w:sz w:val="22"/>
@@ -18918,7 +17440,6 @@
               </w:rPr>
               <w:t>Pollfish</w:t>
             </w:r>
-            <w:proofErr w:type="spellEnd"/>
           </w:p>
         </w:tc>
         <w:tc>
@@ -19073,12 +17594,6 @@
         </w:tc>
       </w:tr>
       <w:tr>
-        <w:tblPrEx>
-          <w:tblCellMar>
-            <w:top w:w="0" w:type="dxa"/>
-            <w:bottom w:w="0" w:type="dxa"/>
-          </w:tblCellMar>
-        </w:tblPrEx>
         <w:trPr>
           <w:cantSplit/>
           <w:jc w:val="center"/>
@@ -19423,11 +17938,7 @@
         <w:t>c</w:t>
       </w:r>
       <w:r>
-        <w:t xml:space="preserve"> × </w:t>
-      </w:r>
-      <w:proofErr w:type="spellStart"/>
-      <w:r>
-        <w:t>R</w:t>
+        <w:t xml:space="preserve"> × R</w:t>
       </w:r>
       <w:r>
         <w:rPr>
@@ -19435,7 +17946,6 @@
         </w:rPr>
         <w:t>c</w:t>
       </w:r>
-      <w:proofErr w:type="spellEnd"/>
       <w:r>
         <w:t xml:space="preserve"> / (P</w:t>
       </w:r>
@@ -19446,11 +17956,7 @@
         <w:t>c</w:t>
       </w:r>
       <w:r>
-        <w:t xml:space="preserve"> + </w:t>
-      </w:r>
-      <w:proofErr w:type="spellStart"/>
-      <w:r>
-        <w:t>R</w:t>
+        <w:t xml:space="preserve"> + R</w:t>
       </w:r>
       <w:r>
         <w:rPr>
@@ -19458,7 +17964,6 @@
         </w:rPr>
         <w:t>c</w:t>
       </w:r>
-      <w:proofErr w:type="spellEnd"/>
       <w:r>
         <w:t>), where P</w:t>
       </w:r>
@@ -19469,11 +17974,7 @@
         <w:t>c</w:t>
       </w:r>
       <w:r>
-        <w:t xml:space="preserve"> is the precision and </w:t>
-      </w:r>
-      <w:proofErr w:type="spellStart"/>
-      <w:r>
-        <w:t>R</w:t>
+        <w:t xml:space="preserve"> is the precision and R</w:t>
       </w:r>
       <w:r>
         <w:rPr>
@@ -19481,7 +17982,6 @@
         </w:rPr>
         <w:t>c</w:t>
       </w:r>
-      <w:proofErr w:type="spellEnd"/>
       <w:r>
         <w:t xml:space="preserve"> the recall of class c, and with the macro-F1, the unweighted mean of F1</w:t>
       </w:r>
@@ -19492,15 +17992,7 @@
         <w:t>c</w:t>
       </w:r>
       <w:r>
-        <w:t xml:space="preserve"> over the positive, neutral and negative classes. The macro average is used because survey answers contain many neutral texts, and a model that ignores a class must be </w:t>
-      </w:r>
-      <w:proofErr w:type="spellStart"/>
-      <w:r>
-        <w:t>penalised</w:t>
-      </w:r>
-      <w:proofErr w:type="spellEnd"/>
-      <w:r>
-        <w:t xml:space="preserve"> even if its overall accuracy looks good. A confusion matrix per language shows which classes a model confuses.</w:t>
+        <w:t xml:space="preserve"> over the positive, neutral and negative classes. The macro average is used because survey answers contain many neutral texts, and a model that ignores a class must be penalised even if its overall accuracy looks good. A confusion matrix per language shows which classes a model confuses.</w:t>
       </w:r>
     </w:p>
     <w:p>
@@ -19530,23 +18022,7 @@
         <w:t>Privacy and measurement design.</w:t>
       </w:r>
       <w:r>
-        <w:t xml:space="preserve"> Pseudonymous analytics hide any group smaller than five respondents, an application of k-anonymity, in which each released record is indistinguishable from at least k−1 others [47]. The order of answer options affects which option is chosen, so the order of questions and options is randomized per respondent where the provider enables it [48]. Requirements are </w:t>
-      </w:r>
-      <w:proofErr w:type="spellStart"/>
-      <w:r>
-        <w:t>prioritised</w:t>
-      </w:r>
-      <w:proofErr w:type="spellEnd"/>
-      <w:r>
-        <w:t xml:space="preserve"> with </w:t>
-      </w:r>
-      <w:proofErr w:type="spellStart"/>
-      <w:r>
-        <w:t>MoSCoW</w:t>
-      </w:r>
-      <w:proofErr w:type="spellEnd"/>
-      <w:r>
-        <w:t xml:space="preserve"> [49].</w:t>
+        <w:t xml:space="preserve"> Pseudonymous analytics hide any group smaller than five respondents, an application of k-anonymity, in which each released record is indistinguishable from at least k−1 others [47]. The order of answer options affects which option is chosen, so the order of questions and options is randomized per respondent where the provider enables it [48]. Requirements are prioritised with MoSCoW [49].</w:t>
       </w:r>
     </w:p>
     <w:p>
@@ -19572,15 +18048,7 @@
         <w:t>Language models as coders of open answers.</w:t>
       </w:r>
       <w:r>
-        <w:t xml:space="preserve"> Large language models are starting to replace manual coding of open-text survey answers. Mellon et al. found that the best model they tested assigned 50 issue categories with 93.9% accuracy, close to a second human coder at 94.7%, and better than supervised models trained on 1,000 labelled cases [50]. For sentiment, a broad evaluation found that large language models do well on simple sentiment tasks and in few-shot settings, which suits languages and domains with little labelled data, but lag on complex sentiment tasks [51]. For Arabic, smaller fine-tuned models still lead on most tasks [27], so the balance between a fine-tuned model and a general model </w:t>
-      </w:r>
-      <w:proofErr w:type="gramStart"/>
-      <w:r>
-        <w:t>has to</w:t>
-      </w:r>
-      <w:proofErr w:type="gramEnd"/>
-      <w:r>
-        <w:t xml:space="preserve"> be measured for each use.</w:t>
+        <w:t xml:space="preserve"> Large language models are starting to replace manual coding of open-text survey answers. Mellon et al. found that the best model they tested assigned 50 issue categories with 93.9% accuracy, close to a second human coder at 94.7%, and better than supervised models trained on 1,000 labelled cases [50]. For sentiment, a broad evaluation found that large language models do well on simple sentiment tasks and in few-shot settings, which suits languages and domains with little labelled data, but lag on complex sentiment tasks [51]. For Arabic, smaller fine-tuned models still lead on most tasks [27], so the balance between a fine-tuned model and a general model has to be measured for each use.</w:t>
       </w:r>
     </w:p>
     <w:p>
@@ -19595,15 +18063,7 @@
         <w:t>Synthetic and AI-assisted respondents.</w:t>
       </w:r>
       <w:r>
-        <w:t xml:space="preserve"> The same models now threaten survey data [23], [24]. Future platforms will rely more on identity-bound accounts, </w:t>
-      </w:r>
-      <w:proofErr w:type="spellStart"/>
-      <w:r>
-        <w:t>behavioural</w:t>
-      </w:r>
-      <w:proofErr w:type="spellEnd"/>
-      <w:r>
-        <w:t xml:space="preserve"> signals collected during answering and the detection of machine-written text. In Smart Survey, the respondent trust levels planned for Graduation Project 2 (FR-24) are the natural place for such controls.</w:t>
+        <w:t xml:space="preserve"> The same models now threaten survey data [23], [24]. Future platforms will rely more on identity-bound accounts, behavioural signals collected during answering and the detection of machine-written text. In Smart Survey, the respondent trust levels planned for Graduation Project 2 (FR-24) are the natural place for such controls.</w:t>
       </w:r>
     </w:p>
     <w:p>
@@ -19678,23 +18138,7 @@
           <w:szCs w:val="22"/>
         </w:rPr>
         <w:tab/>
-        <w:t xml:space="preserve">Prolific, "Who are the participants on </w:t>
-      </w:r>
-      <w:proofErr w:type="gramStart"/>
-      <w:r>
-        <w:rPr>
-          <w:sz w:val="22"/>
-          <w:szCs w:val="22"/>
-        </w:rPr>
-        <w:t>Prolific?,</w:t>
-      </w:r>
-      <w:proofErr w:type="gramEnd"/>
-      <w:r>
-        <w:rPr>
-          <w:sz w:val="22"/>
-          <w:szCs w:val="22"/>
-        </w:rPr>
-        <w:t>" researcher-help.prolific.com. [Online]. Available: https://researcher-help.prolific.com/en/articles/445224-who-are-the-participants-on-prolific (accessed Oct. 23, 2026).</w:t>
+        <w:t>Prolific, "Who are the participants on Prolific?," researcher-help.prolific.com. [Online]. Available: https://researcher-help.prolific.com/en/articles/445224-who-are-the-participants-on-prolific (accessed Oct. 23, 2026).</w:t>
       </w:r>
     </w:p>
     <w:p>
@@ -19718,22 +18162,7 @@
           <w:szCs w:val="22"/>
         </w:rPr>
         <w:tab/>
-      </w:r>
-      <w:proofErr w:type="spellStart"/>
-      <w:r>
-        <w:rPr>
-          <w:sz w:val="22"/>
-          <w:szCs w:val="22"/>
-        </w:rPr>
-        <w:t>Pollfish</w:t>
-      </w:r>
-      <w:proofErr w:type="spellEnd"/>
-      <w:r>
-        <w:rPr>
-          <w:sz w:val="22"/>
-          <w:szCs w:val="22"/>
-        </w:rPr>
-        <w:t>, "Creating a survey in multiple languages," pollfish.com. [Online]. Available: https://www.pollfish.com/resources/blog/pollfish-school/creating-a-survey-in-multiple-languages/ (accessed Oct. 23, 2026).</w:t>
+        <w:t>Pollfish, "Creating a survey in multiple languages," pollfish.com. [Online]. Available: https://www.pollfish.com/resources/blog/pollfish-school/creating-a-survey-in-multiple-languages/ (accessed Oct. 23, 2026).</w:t>
       </w:r>
     </w:p>
     <w:p>
@@ -19757,71 +18186,7 @@
           <w:szCs w:val="22"/>
         </w:rPr>
         <w:tab/>
-        <w:t xml:space="preserve">R. </w:t>
-      </w:r>
-      <w:proofErr w:type="spellStart"/>
-      <w:r>
-        <w:rPr>
-          <w:sz w:val="22"/>
-          <w:szCs w:val="22"/>
-        </w:rPr>
-        <w:t>Pozzar</w:t>
-      </w:r>
-      <w:proofErr w:type="spellEnd"/>
-      <w:r>
-        <w:rPr>
-          <w:sz w:val="22"/>
-          <w:szCs w:val="22"/>
-        </w:rPr>
-        <w:t>, M. J. Hammer, M. Underhill-</w:t>
-      </w:r>
-      <w:proofErr w:type="spellStart"/>
-      <w:r>
-        <w:rPr>
-          <w:sz w:val="22"/>
-          <w:szCs w:val="22"/>
-        </w:rPr>
-        <w:t>Blazey</w:t>
-      </w:r>
-      <w:proofErr w:type="spellEnd"/>
-      <w:r>
-        <w:rPr>
-          <w:sz w:val="22"/>
-          <w:szCs w:val="22"/>
-        </w:rPr>
-        <w:t xml:space="preserve">, A. A. Wright, J. A. </w:t>
-      </w:r>
-      <w:proofErr w:type="spellStart"/>
-      <w:r>
-        <w:rPr>
-          <w:sz w:val="22"/>
-          <w:szCs w:val="22"/>
-        </w:rPr>
-        <w:t>Tulsky</w:t>
-      </w:r>
-      <w:proofErr w:type="spellEnd"/>
-      <w:r>
-        <w:rPr>
-          <w:sz w:val="22"/>
-          <w:szCs w:val="22"/>
-        </w:rPr>
-        <w:t xml:space="preserve">, F. Hong, D. A. Gundersen, and D. L. Berry, "Threats of bots and other bad actors to data quality following research participant recruitment through social media," J. Med. Internet Res., vol. 22, no. 10, Art. no. e23021, 2020, </w:t>
-      </w:r>
-      <w:proofErr w:type="spellStart"/>
-      <w:r>
-        <w:rPr>
-          <w:sz w:val="22"/>
-          <w:szCs w:val="22"/>
-        </w:rPr>
-        <w:t>doi</w:t>
-      </w:r>
-      <w:proofErr w:type="spellEnd"/>
-      <w:r>
-        <w:rPr>
-          <w:sz w:val="22"/>
-          <w:szCs w:val="22"/>
-        </w:rPr>
-        <w:t>: 10.2196/23021.</w:t>
+        <w:t>R. Pozzar, M. J. Hammer, M. Underhill-Blazey, A. A. Wright, J. A. Tulsky, F. Hong, D. A. Gundersen, and D. L. Berry, "Threats of bots and other bad actors to data quality following research participant recruitment through social media," J. Med. Internet Res., vol. 22, no. 10, Art. no. e23021, 2020, doi: 10.2196/23021.</w:t>
       </w:r>
     </w:p>
     <w:p>
@@ -19845,22 +18210,7 @@
           <w:szCs w:val="22"/>
         </w:rPr>
         <w:tab/>
-      </w:r>
-      <w:proofErr w:type="spellStart"/>
-      <w:r>
-        <w:rPr>
-          <w:sz w:val="22"/>
-          <w:szCs w:val="22"/>
-        </w:rPr>
-        <w:t>Typeform</w:t>
-      </w:r>
-      <w:proofErr w:type="spellEnd"/>
-      <w:r>
-        <w:rPr>
-          <w:sz w:val="22"/>
-          <w:szCs w:val="22"/>
-        </w:rPr>
-        <w:t>, "Smart Insights: qualitative and quantitative analysis," help.typeform.com (accessed Oct. 27, 2026).</w:t>
+        <w:t>Typeform, "Smart Insights: qualitative and quantitative analysis," help.typeform.com (accessed Oct. 27, 2026).</w:t>
       </w:r>
     </w:p>
     <w:p>
@@ -20004,23 +18354,7 @@
           <w:szCs w:val="22"/>
         </w:rPr>
         <w:tab/>
-        <w:t xml:space="preserve">K. </w:t>
-      </w:r>
-      <w:proofErr w:type="spellStart"/>
-      <w:r>
-        <w:rPr>
-          <w:sz w:val="22"/>
-          <w:szCs w:val="22"/>
-        </w:rPr>
-        <w:t>Schwaber</w:t>
-      </w:r>
-      <w:proofErr w:type="spellEnd"/>
-      <w:r>
-        <w:rPr>
-          <w:sz w:val="22"/>
-          <w:szCs w:val="22"/>
-        </w:rPr>
-        <w:t xml:space="preserve"> and J. Sutherland, The Scrum Guide, Nov. 2020. [Online]. Available: https://scrumguides.org</w:t>
+        <w:t>K. Schwaber and J. Sutherland, The Scrum Guide, Nov. 2020. [Online]. Available: https://scrumguides.org</w:t>
       </w:r>
     </w:p>
     <w:p>
@@ -20044,55 +18378,7 @@
           <w:szCs w:val="22"/>
         </w:rPr>
         <w:tab/>
-        <w:t xml:space="preserve">J. </w:t>
-      </w:r>
-      <w:proofErr w:type="spellStart"/>
-      <w:r>
-        <w:rPr>
-          <w:sz w:val="22"/>
-          <w:szCs w:val="22"/>
-        </w:rPr>
-        <w:t>Saltz</w:t>
-      </w:r>
-      <w:proofErr w:type="spellEnd"/>
-      <w:r>
-        <w:rPr>
-          <w:sz w:val="22"/>
-          <w:szCs w:val="22"/>
-        </w:rPr>
-        <w:t xml:space="preserve">, R. Heckman, and I. </w:t>
-      </w:r>
-      <w:proofErr w:type="spellStart"/>
-      <w:r>
-        <w:rPr>
-          <w:sz w:val="22"/>
-          <w:szCs w:val="22"/>
-        </w:rPr>
-        <w:t>Shamshurin</w:t>
-      </w:r>
-      <w:proofErr w:type="spellEnd"/>
-      <w:r>
-        <w:rPr>
-          <w:sz w:val="22"/>
-          <w:szCs w:val="22"/>
-        </w:rPr>
-        <w:t xml:space="preserve">, "Exploring how different project management methodologies impact data science students," in Proc. 25th Eur. Conf. Inf. Syst. (ECIS), </w:t>
-      </w:r>
-      <w:proofErr w:type="spellStart"/>
-      <w:r>
-        <w:rPr>
-          <w:sz w:val="22"/>
-          <w:szCs w:val="22"/>
-        </w:rPr>
-        <w:t>Guimarães</w:t>
-      </w:r>
-      <w:proofErr w:type="spellEnd"/>
-      <w:r>
-        <w:rPr>
-          <w:sz w:val="22"/>
-          <w:szCs w:val="22"/>
-        </w:rPr>
-        <w:t>, Portugal, 2017, pp. 2939–2948.</w:t>
+        <w:t>J. Saltz, R. Heckman, and I. Shamshurin, "Exploring how different project management methodologies impact data science students," in Proc. 25th Eur. Conf. Inf. Syst. (ECIS), Guimarães, Portugal, 2017, pp. 2939–2948.</w:t>
       </w:r>
     </w:p>
     <w:p>
@@ -20116,39 +18402,7 @@
           <w:szCs w:val="22"/>
         </w:rPr>
         <w:tab/>
-        <w:t xml:space="preserve">H.-F. Chang and M. </w:t>
-      </w:r>
-      <w:proofErr w:type="spellStart"/>
-      <w:r>
-        <w:rPr>
-          <w:sz w:val="22"/>
-          <w:szCs w:val="22"/>
-        </w:rPr>
-        <w:t>Shokrolah</w:t>
-      </w:r>
-      <w:proofErr w:type="spellEnd"/>
-      <w:r>
-        <w:rPr>
-          <w:sz w:val="22"/>
-          <w:szCs w:val="22"/>
-        </w:rPr>
-        <w:t xml:space="preserve"> Shirazi, "Adapting Scrum for software capstone courses," Informatics in Education, vol. 21, no. 4, pp. 605–634, 2022, </w:t>
-      </w:r>
-      <w:proofErr w:type="spellStart"/>
-      <w:r>
-        <w:rPr>
-          <w:sz w:val="22"/>
-          <w:szCs w:val="22"/>
-        </w:rPr>
-        <w:t>doi</w:t>
-      </w:r>
-      <w:proofErr w:type="spellEnd"/>
-      <w:r>
-        <w:rPr>
-          <w:sz w:val="22"/>
-          <w:szCs w:val="22"/>
-        </w:rPr>
-        <w:t>: 10.15388/infedu.2022.25.</w:t>
+        <w:t>H.-F. Chang and M. Shokrolah Shirazi, "Adapting Scrum for software capstone courses," Informatics in Education, vol. 21, no. 4, pp. 605–634, 2022, doi: 10.15388/infedu.2022.25.</w:t>
       </w:r>
     </w:p>
     <w:p>
@@ -20196,39 +18450,7 @@
           <w:szCs w:val="22"/>
         </w:rPr>
         <w:tab/>
-        <w:t xml:space="preserve">R. </w:t>
-      </w:r>
-      <w:proofErr w:type="spellStart"/>
-      <w:r>
-        <w:rPr>
-          <w:sz w:val="22"/>
-          <w:szCs w:val="22"/>
-        </w:rPr>
-        <w:t>Vallon</w:t>
-      </w:r>
-      <w:proofErr w:type="spellEnd"/>
-      <w:r>
-        <w:rPr>
-          <w:sz w:val="22"/>
-          <w:szCs w:val="22"/>
-        </w:rPr>
-        <w:t xml:space="preserve">, S. Strobl, M. Ras, M. Bernhart, and T. </w:t>
-      </w:r>
-      <w:proofErr w:type="spellStart"/>
-      <w:r>
-        <w:rPr>
-          <w:sz w:val="22"/>
-          <w:szCs w:val="22"/>
-        </w:rPr>
-        <w:t>Grechenig</w:t>
-      </w:r>
-      <w:proofErr w:type="spellEnd"/>
-      <w:r>
-        <w:rPr>
-          <w:sz w:val="22"/>
-          <w:szCs w:val="22"/>
-        </w:rPr>
-        <w:t>, "Distributed Kanban with limited geographical distance: Analyzing lean principles pull, work in progress and kaizen," in Proc. 14th Int. Conf. Evaluation of Novel Approaches to Software Engineering (ENASE), 2019, pp. 210–217.</w:t>
+        <w:t>R. Vallon, S. Strobl, M. Ras, M. Bernhart, and T. Grechenig, "Distributed Kanban with limited geographical distance: Analyzing lean principles pull, work in progress and kaizen," in Proc. 14th Int. Conf. Evaluation of Novel Approaches to Software Engineering (ENASE), 2019, pp. 210–217.</w:t>
       </w:r>
     </w:p>
     <w:p>
@@ -20301,23 +18523,7 @@
           <w:szCs w:val="22"/>
         </w:rPr>
         <w:tab/>
-        <w:t>ISO/IEC 25010:2023, Systems and software engineering — Systems and software Quality Requirements and Evaluation (</w:t>
-      </w:r>
-      <w:proofErr w:type="spellStart"/>
-      <w:r>
-        <w:rPr>
-          <w:sz w:val="22"/>
-          <w:szCs w:val="22"/>
-        </w:rPr>
-        <w:t>SQuaRE</w:t>
-      </w:r>
-      <w:proofErr w:type="spellEnd"/>
-      <w:r>
-        <w:rPr>
-          <w:sz w:val="22"/>
-          <w:szCs w:val="22"/>
-        </w:rPr>
-        <w:t>) — Product quality model. Geneva, Switzerland: ISO, 2023.</w:t>
+        <w:t>ISO/IEC 25010:2023, Systems and software engineering — Systems and software Quality Requirements and Evaluation (SQuaRE) — Product quality model. Geneva, Switzerland: ISO, 2023.</w:t>
       </w:r>
     </w:p>
     <w:p>
@@ -20365,71 +18571,7 @@
           <w:szCs w:val="22"/>
         </w:rPr>
         <w:tab/>
-        <w:t xml:space="preserve">E. Peer, D. Rothschild, A. Gordon, Z. </w:t>
-      </w:r>
-      <w:proofErr w:type="spellStart"/>
-      <w:r>
-        <w:rPr>
-          <w:sz w:val="22"/>
-          <w:szCs w:val="22"/>
-        </w:rPr>
-        <w:t>Evernden</w:t>
-      </w:r>
-      <w:proofErr w:type="spellEnd"/>
-      <w:r>
-        <w:rPr>
-          <w:sz w:val="22"/>
-          <w:szCs w:val="22"/>
-        </w:rPr>
-        <w:t xml:space="preserve">, and E. </w:t>
-      </w:r>
-      <w:proofErr w:type="spellStart"/>
-      <w:r>
-        <w:rPr>
-          <w:sz w:val="22"/>
-          <w:szCs w:val="22"/>
-        </w:rPr>
-        <w:t>Damer</w:t>
-      </w:r>
-      <w:proofErr w:type="spellEnd"/>
-      <w:r>
-        <w:rPr>
-          <w:sz w:val="22"/>
-          <w:szCs w:val="22"/>
-        </w:rPr>
-        <w:t xml:space="preserve">, "Data quality of platforms and panels for online behavioral research," </w:t>
-      </w:r>
-      <w:proofErr w:type="spellStart"/>
-      <w:r>
-        <w:rPr>
-          <w:sz w:val="22"/>
-          <w:szCs w:val="22"/>
-        </w:rPr>
-        <w:t>Behav</w:t>
-      </w:r>
-      <w:proofErr w:type="spellEnd"/>
-      <w:r>
-        <w:rPr>
-          <w:sz w:val="22"/>
-          <w:szCs w:val="22"/>
-        </w:rPr>
-        <w:t xml:space="preserve">. Res. Methods, vol. 54, no. 4, pp. 1643–1662, 2022, </w:t>
-      </w:r>
-      <w:proofErr w:type="spellStart"/>
-      <w:r>
-        <w:rPr>
-          <w:sz w:val="22"/>
-          <w:szCs w:val="22"/>
-        </w:rPr>
-        <w:t>doi</w:t>
-      </w:r>
-      <w:proofErr w:type="spellEnd"/>
-      <w:r>
-        <w:rPr>
-          <w:sz w:val="22"/>
-          <w:szCs w:val="22"/>
-        </w:rPr>
-        <w:t>: 10.3758/s13428-021-01694-3.</w:t>
+        <w:t>E. Peer, D. Rothschild, A. Gordon, Z. Evernden, and E. Damer, "Data quality of platforms and panels for online behavioral research," Behav. Res. Methods, vol. 54, no. 4, pp. 1643–1662, 2022, doi: 10.3758/s13428-021-01694-3.</w:t>
       </w:r>
     </w:p>
     <w:p>
@@ -20453,71 +18595,7 @@
           <w:szCs w:val="22"/>
         </w:rPr>
         <w:tab/>
-        <w:t xml:space="preserve">B. D. Douglas, P. J. Ewell, and M. </w:t>
-      </w:r>
-      <w:proofErr w:type="spellStart"/>
-      <w:r>
-        <w:rPr>
-          <w:sz w:val="22"/>
-          <w:szCs w:val="22"/>
-        </w:rPr>
-        <w:t>Brauer</w:t>
-      </w:r>
-      <w:proofErr w:type="spellEnd"/>
-      <w:r>
-        <w:rPr>
-          <w:sz w:val="22"/>
-          <w:szCs w:val="22"/>
-        </w:rPr>
-        <w:t xml:space="preserve">, "Data quality in online human-subjects research: Comparisons between </w:t>
-      </w:r>
-      <w:proofErr w:type="spellStart"/>
-      <w:r>
-        <w:rPr>
-          <w:sz w:val="22"/>
-          <w:szCs w:val="22"/>
-        </w:rPr>
-        <w:t>MTurk</w:t>
-      </w:r>
-      <w:proofErr w:type="spellEnd"/>
-      <w:r>
-        <w:rPr>
-          <w:sz w:val="22"/>
-          <w:szCs w:val="22"/>
-        </w:rPr>
-        <w:t xml:space="preserve">, Prolific, </w:t>
-      </w:r>
-      <w:proofErr w:type="spellStart"/>
-      <w:r>
-        <w:rPr>
-          <w:sz w:val="22"/>
-          <w:szCs w:val="22"/>
-        </w:rPr>
-        <w:t>CloudResearch</w:t>
-      </w:r>
-      <w:proofErr w:type="spellEnd"/>
-      <w:r>
-        <w:rPr>
-          <w:sz w:val="22"/>
-          <w:szCs w:val="22"/>
-        </w:rPr>
-        <w:t xml:space="preserve">, Qualtrics, and SONA," PLOS ONE, vol. 18, no. 3, Art. no. e0279720, 2023, </w:t>
-      </w:r>
-      <w:proofErr w:type="spellStart"/>
-      <w:r>
-        <w:rPr>
-          <w:sz w:val="22"/>
-          <w:szCs w:val="22"/>
-        </w:rPr>
-        <w:t>doi</w:t>
-      </w:r>
-      <w:proofErr w:type="spellEnd"/>
-      <w:r>
-        <w:rPr>
-          <w:sz w:val="22"/>
-          <w:szCs w:val="22"/>
-        </w:rPr>
-        <w:t>: 10.1371/journal.pone.0279720.</w:t>
+        <w:t>B. D. Douglas, P. J. Ewell, and M. Brauer, "Data quality in online human-subjects research: Comparisons between MTurk, Prolific, CloudResearch, Qualtrics, and SONA," PLOS ONE, vol. 18, no. 3, Art. no. e0279720, 2023, doi: 10.1371/journal.pone.0279720.</w:t>
       </w:r>
     </w:p>
     <w:p>
@@ -20541,23 +18619,7 @@
           <w:szCs w:val="22"/>
         </w:rPr>
         <w:tab/>
-        <w:t xml:space="preserve">M. K. Ward and A. W. Meade, "Dealing with careless responding in survey data: Prevention, identification, and recommended best practices," Annu. Rev. Psychol., vol. 74, pp. 577–596, 2023, </w:t>
-      </w:r>
-      <w:proofErr w:type="spellStart"/>
-      <w:r>
-        <w:rPr>
-          <w:sz w:val="22"/>
-          <w:szCs w:val="22"/>
-        </w:rPr>
-        <w:t>doi</w:t>
-      </w:r>
-      <w:proofErr w:type="spellEnd"/>
-      <w:r>
-        <w:rPr>
-          <w:sz w:val="22"/>
-          <w:szCs w:val="22"/>
-        </w:rPr>
-        <w:t>: 10.1146/annurev-psych-040422-045007.</w:t>
+        <w:t>M. K. Ward and A. W. Meade, "Dealing with careless responding in survey data: Prevention, identification, and recommended best practices," Annu. Rev. Psychol., vol. 74, pp. 577–596, 2023, doi: 10.1146/annurev-psych-040422-045007.</w:t>
       </w:r>
     </w:p>
     <w:p>
@@ -20581,23 +18643,7 @@
           <w:szCs w:val="22"/>
         </w:rPr>
         <w:tab/>
-        <w:t xml:space="preserve">S. Westwood, "The potential existential threat of large language models to online survey research," Proc. Natl. Acad. Sci. U.S.A., 2025, </w:t>
-      </w:r>
-      <w:proofErr w:type="spellStart"/>
-      <w:r>
-        <w:rPr>
-          <w:sz w:val="22"/>
-          <w:szCs w:val="22"/>
-        </w:rPr>
-        <w:t>doi</w:t>
-      </w:r>
-      <w:proofErr w:type="spellEnd"/>
-      <w:r>
-        <w:rPr>
-          <w:sz w:val="22"/>
-          <w:szCs w:val="22"/>
-        </w:rPr>
-        <w:t>: 10.1073/pnas.2518075122.</w:t>
+        <w:t>S. Westwood, "The potential existential threat of large language models to online survey research," Proc. Natl. Acad. Sci. U.S.A., 2025, doi: 10.1073/pnas.2518075122.</w:t>
       </w:r>
     </w:p>
     <w:p>
@@ -20621,55 +18667,7 @@
           <w:szCs w:val="22"/>
         </w:rPr>
         <w:tab/>
-        <w:t xml:space="preserve">S. Zhang, J. Xu, and A. J. </w:t>
-      </w:r>
-      <w:proofErr w:type="spellStart"/>
-      <w:r>
-        <w:rPr>
-          <w:sz w:val="22"/>
-          <w:szCs w:val="22"/>
-        </w:rPr>
-        <w:t>Alvero</w:t>
-      </w:r>
-      <w:proofErr w:type="spellEnd"/>
-      <w:r>
-        <w:rPr>
-          <w:sz w:val="22"/>
-          <w:szCs w:val="22"/>
-        </w:rPr>
-        <w:t xml:space="preserve">, "Generative AI meets open-ended survey responses: Research participant use of AI and homogenization," </w:t>
-      </w:r>
-      <w:proofErr w:type="spellStart"/>
-      <w:r>
-        <w:rPr>
-          <w:sz w:val="22"/>
-          <w:szCs w:val="22"/>
-        </w:rPr>
-        <w:t>Sociol</w:t>
-      </w:r>
-      <w:proofErr w:type="spellEnd"/>
-      <w:r>
-        <w:rPr>
-          <w:sz w:val="22"/>
-          <w:szCs w:val="22"/>
-        </w:rPr>
-        <w:t xml:space="preserve">. Methods Res., vol. 54, no. 3, pp. 1197–1242, 2025, </w:t>
-      </w:r>
-      <w:proofErr w:type="spellStart"/>
-      <w:r>
-        <w:rPr>
-          <w:sz w:val="22"/>
-          <w:szCs w:val="22"/>
-        </w:rPr>
-        <w:t>doi</w:t>
-      </w:r>
-      <w:proofErr w:type="spellEnd"/>
-      <w:r>
-        <w:rPr>
-          <w:sz w:val="22"/>
-          <w:szCs w:val="22"/>
-        </w:rPr>
-        <w:t>: 10.1177/00491241251327130.</w:t>
+        <w:t>S. Zhang, J. Xu, and A. J. Alvero, "Generative AI meets open-ended survey responses: Research participant use of AI and homogenization," Sociol. Methods Res., vol. 54, no. 3, pp. 1197–1242, 2025, doi: 10.1177/00491241251327130.</w:t>
       </w:r>
     </w:p>
     <w:p>
@@ -20717,183 +18715,7 @@
           <w:szCs w:val="22"/>
         </w:rPr>
         <w:tab/>
-        <w:t>A. Al-</w:t>
-      </w:r>
-      <w:proofErr w:type="spellStart"/>
-      <w:r>
-        <w:rPr>
-          <w:sz w:val="22"/>
-          <w:szCs w:val="22"/>
-        </w:rPr>
-        <w:t>Thubaity</w:t>
-      </w:r>
-      <w:proofErr w:type="spellEnd"/>
-      <w:r>
-        <w:rPr>
-          <w:sz w:val="22"/>
-          <w:szCs w:val="22"/>
-        </w:rPr>
-        <w:t xml:space="preserve">, S. </w:t>
-      </w:r>
-      <w:proofErr w:type="spellStart"/>
-      <w:r>
-        <w:rPr>
-          <w:sz w:val="22"/>
-          <w:szCs w:val="22"/>
-        </w:rPr>
-        <w:t>Alkhereyf</w:t>
-      </w:r>
-      <w:proofErr w:type="spellEnd"/>
-      <w:r>
-        <w:rPr>
-          <w:sz w:val="22"/>
-          <w:szCs w:val="22"/>
-        </w:rPr>
-        <w:t xml:space="preserve">, H. </w:t>
-      </w:r>
-      <w:proofErr w:type="spellStart"/>
-      <w:r>
-        <w:rPr>
-          <w:sz w:val="22"/>
-          <w:szCs w:val="22"/>
-        </w:rPr>
-        <w:t>Murayshid</w:t>
-      </w:r>
-      <w:proofErr w:type="spellEnd"/>
-      <w:r>
-        <w:rPr>
-          <w:sz w:val="22"/>
-          <w:szCs w:val="22"/>
-        </w:rPr>
-        <w:t xml:space="preserve">, N. </w:t>
-      </w:r>
-      <w:proofErr w:type="spellStart"/>
-      <w:r>
-        <w:rPr>
-          <w:sz w:val="22"/>
-          <w:szCs w:val="22"/>
-        </w:rPr>
-        <w:t>Alshalawi</w:t>
-      </w:r>
-      <w:proofErr w:type="spellEnd"/>
-      <w:r>
-        <w:rPr>
-          <w:sz w:val="22"/>
-          <w:szCs w:val="22"/>
-        </w:rPr>
-        <w:t xml:space="preserve">, M. </w:t>
-      </w:r>
-      <w:proofErr w:type="spellStart"/>
-      <w:r>
-        <w:rPr>
-          <w:sz w:val="22"/>
-          <w:szCs w:val="22"/>
-        </w:rPr>
-        <w:t>Omirah</w:t>
-      </w:r>
-      <w:proofErr w:type="spellEnd"/>
-      <w:r>
-        <w:rPr>
-          <w:sz w:val="22"/>
-          <w:szCs w:val="22"/>
-        </w:rPr>
-        <w:t xml:space="preserve">, R. </w:t>
-      </w:r>
-      <w:proofErr w:type="spellStart"/>
-      <w:r>
-        <w:rPr>
-          <w:sz w:val="22"/>
-          <w:szCs w:val="22"/>
-        </w:rPr>
-        <w:t>Alateeq</w:t>
-      </w:r>
-      <w:proofErr w:type="spellEnd"/>
-      <w:r>
-        <w:rPr>
-          <w:sz w:val="22"/>
-          <w:szCs w:val="22"/>
-        </w:rPr>
-        <w:t xml:space="preserve">, R. Almutairi, R. </w:t>
-      </w:r>
-      <w:proofErr w:type="spellStart"/>
-      <w:r>
-        <w:rPr>
-          <w:sz w:val="22"/>
-          <w:szCs w:val="22"/>
-        </w:rPr>
-        <w:t>Alsuwailem</w:t>
-      </w:r>
-      <w:proofErr w:type="spellEnd"/>
-      <w:r>
-        <w:rPr>
-          <w:sz w:val="22"/>
-          <w:szCs w:val="22"/>
-        </w:rPr>
-        <w:t xml:space="preserve">, M. </w:t>
-      </w:r>
-      <w:proofErr w:type="spellStart"/>
-      <w:r>
-        <w:rPr>
-          <w:sz w:val="22"/>
-          <w:szCs w:val="22"/>
-        </w:rPr>
-        <w:t>Alhassoun</w:t>
-      </w:r>
-      <w:proofErr w:type="spellEnd"/>
-      <w:r>
-        <w:rPr>
-          <w:sz w:val="22"/>
-          <w:szCs w:val="22"/>
-        </w:rPr>
-        <w:t xml:space="preserve">, and I. </w:t>
-      </w:r>
-      <w:proofErr w:type="spellStart"/>
-      <w:r>
-        <w:rPr>
-          <w:sz w:val="22"/>
-          <w:szCs w:val="22"/>
-        </w:rPr>
-        <w:t>Alkhanen</w:t>
-      </w:r>
-      <w:proofErr w:type="spellEnd"/>
-      <w:r>
-        <w:rPr>
-          <w:sz w:val="22"/>
-          <w:szCs w:val="22"/>
-        </w:rPr>
-        <w:t xml:space="preserve">, "Evaluating ChatGPT and Bard AI on Arabic sentiment analysis," in Proc. </w:t>
-      </w:r>
-      <w:proofErr w:type="spellStart"/>
-      <w:r>
-        <w:rPr>
-          <w:sz w:val="22"/>
-          <w:szCs w:val="22"/>
-        </w:rPr>
-        <w:t>ArabicNLP</w:t>
-      </w:r>
-      <w:proofErr w:type="spellEnd"/>
-      <w:r>
-        <w:rPr>
-          <w:sz w:val="22"/>
-          <w:szCs w:val="22"/>
-        </w:rPr>
-        <w:t xml:space="preserve"> 2023, Singapore, 2023, pp. 335–349, </w:t>
-      </w:r>
-      <w:proofErr w:type="spellStart"/>
-      <w:r>
-        <w:rPr>
-          <w:sz w:val="22"/>
-          <w:szCs w:val="22"/>
-        </w:rPr>
-        <w:t>doi</w:t>
-      </w:r>
-      <w:proofErr w:type="spellEnd"/>
-      <w:r>
-        <w:rPr>
-          <w:sz w:val="22"/>
-          <w:szCs w:val="22"/>
-        </w:rPr>
-        <w:t>: 10.18653/v1/2023.arabicnlp-1.27.</w:t>
+        <w:t>A. Al-Thubaity, S. Alkhereyf, H. Murayshid, N. Alshalawi, M. Omirah, R. Alateeq, R. Almutairi, R. Alsuwailem, M. Alhassoun, and I. Alkhanen, "Evaluating ChatGPT and Bard AI on Arabic sentiment analysis," in Proc. ArabicNLP 2023, Singapore, 2023, pp. 335–349, doi: 10.18653/v1/2023.arabicnlp-1.27.</w:t>
       </w:r>
     </w:p>
     <w:p>
@@ -20917,103 +18739,7 @@
           <w:szCs w:val="22"/>
         </w:rPr>
         <w:tab/>
-        <w:t xml:space="preserve">M. T. I. </w:t>
-      </w:r>
-      <w:proofErr w:type="spellStart"/>
-      <w:r>
-        <w:rPr>
-          <w:sz w:val="22"/>
-          <w:szCs w:val="22"/>
-        </w:rPr>
-        <w:t>Khondaker</w:t>
-      </w:r>
-      <w:proofErr w:type="spellEnd"/>
-      <w:r>
-        <w:rPr>
-          <w:sz w:val="22"/>
-          <w:szCs w:val="22"/>
-        </w:rPr>
-        <w:t xml:space="preserve">, A. </w:t>
-      </w:r>
-      <w:proofErr w:type="spellStart"/>
-      <w:r>
-        <w:rPr>
-          <w:sz w:val="22"/>
-          <w:szCs w:val="22"/>
-        </w:rPr>
-        <w:t>Waheed</w:t>
-      </w:r>
-      <w:proofErr w:type="spellEnd"/>
-      <w:r>
-        <w:rPr>
-          <w:sz w:val="22"/>
-          <w:szCs w:val="22"/>
-        </w:rPr>
-        <w:t xml:space="preserve">, E. M. B. </w:t>
-      </w:r>
-      <w:proofErr w:type="spellStart"/>
-      <w:r>
-        <w:rPr>
-          <w:sz w:val="22"/>
-          <w:szCs w:val="22"/>
-        </w:rPr>
-        <w:t>Nagoudi</w:t>
-      </w:r>
-      <w:proofErr w:type="spellEnd"/>
-      <w:r>
-        <w:rPr>
-          <w:sz w:val="22"/>
-          <w:szCs w:val="22"/>
-        </w:rPr>
-        <w:t>, and M. Abdul-</w:t>
-      </w:r>
-      <w:proofErr w:type="spellStart"/>
-      <w:r>
-        <w:rPr>
-          <w:sz w:val="22"/>
-          <w:szCs w:val="22"/>
-        </w:rPr>
-        <w:t>Mageed</w:t>
-      </w:r>
-      <w:proofErr w:type="spellEnd"/>
-      <w:r>
-        <w:rPr>
-          <w:sz w:val="22"/>
-          <w:szCs w:val="22"/>
-        </w:rPr>
-        <w:t>, "</w:t>
-      </w:r>
-      <w:proofErr w:type="spellStart"/>
-      <w:r>
-        <w:rPr>
-          <w:sz w:val="22"/>
-          <w:szCs w:val="22"/>
-        </w:rPr>
-        <w:t>GPTAraEval</w:t>
-      </w:r>
-      <w:proofErr w:type="spellEnd"/>
-      <w:r>
-        <w:rPr>
-          <w:sz w:val="22"/>
-          <w:szCs w:val="22"/>
-        </w:rPr>
-        <w:t xml:space="preserve">: A comprehensive evaluation of ChatGPT on Arabic NLP," in Proc. 2023 Conf. Empirical Methods in Natural Language Processing (EMNLP), Singapore, 2023, pp. 220–247, </w:t>
-      </w:r>
-      <w:proofErr w:type="spellStart"/>
-      <w:r>
-        <w:rPr>
-          <w:sz w:val="22"/>
-          <w:szCs w:val="22"/>
-        </w:rPr>
-        <w:t>doi</w:t>
-      </w:r>
-      <w:proofErr w:type="spellEnd"/>
-      <w:r>
-        <w:rPr>
-          <w:sz w:val="22"/>
-          <w:szCs w:val="22"/>
-        </w:rPr>
-        <w:t>: 10.18653/v1/2023.emnlp-main.16.</w:t>
+        <w:t>M. T. I. Khondaker, A. Waheed, E. M. B. Nagoudi, and M. Abdul-Mageed, "GPTAraEval: A comprehensive evaluation of ChatGPT on Arabic NLP," in Proc. 2023 Conf. Empirical Methods in Natural Language Processing (EMNLP), Singapore, 2023, pp. 220–247, doi: 10.18653/v1/2023.emnlp-main.16.</w:t>
       </w:r>
     </w:p>
     <w:p>
@@ -21037,87 +18763,7 @@
           <w:szCs w:val="22"/>
         </w:rPr>
         <w:tab/>
-        <w:t xml:space="preserve">J. A. </w:t>
-      </w:r>
-      <w:proofErr w:type="spellStart"/>
-      <w:r>
-        <w:rPr>
-          <w:sz w:val="22"/>
-          <w:szCs w:val="22"/>
-        </w:rPr>
-        <w:t>Lossio</w:t>
-      </w:r>
-      <w:proofErr w:type="spellEnd"/>
-      <w:r>
-        <w:rPr>
-          <w:sz w:val="22"/>
-          <w:szCs w:val="22"/>
-        </w:rPr>
-        <w:t xml:space="preserve">-Ventura, R. </w:t>
-      </w:r>
-      <w:proofErr w:type="spellStart"/>
-      <w:r>
-        <w:rPr>
-          <w:sz w:val="22"/>
-          <w:szCs w:val="22"/>
-        </w:rPr>
-        <w:t>Weger</w:t>
-      </w:r>
-      <w:proofErr w:type="spellEnd"/>
-      <w:r>
-        <w:rPr>
-          <w:sz w:val="22"/>
-          <w:szCs w:val="22"/>
-        </w:rPr>
-        <w:t xml:space="preserve">, A. Y. Lee, E. P. Guinee, J. Chung, L. Atlas, E. </w:t>
-      </w:r>
-      <w:proofErr w:type="spellStart"/>
-      <w:r>
-        <w:rPr>
-          <w:sz w:val="22"/>
-          <w:szCs w:val="22"/>
-        </w:rPr>
-        <w:t>Linos</w:t>
-      </w:r>
-      <w:proofErr w:type="spellEnd"/>
-      <w:r>
-        <w:rPr>
-          <w:sz w:val="22"/>
-          <w:szCs w:val="22"/>
-        </w:rPr>
-        <w:t xml:space="preserve">, and F. Pereira, "A comparison of ChatGPT and fine-tuned open pre-trained transformers (OPT) against widely used sentiment analysis tools: Sentiment analysis of COVID-19 survey data," JMIR </w:t>
-      </w:r>
-      <w:proofErr w:type="spellStart"/>
-      <w:r>
-        <w:rPr>
-          <w:sz w:val="22"/>
-          <w:szCs w:val="22"/>
-        </w:rPr>
-        <w:t>Ment</w:t>
-      </w:r>
-      <w:proofErr w:type="spellEnd"/>
-      <w:r>
-        <w:rPr>
-          <w:sz w:val="22"/>
-          <w:szCs w:val="22"/>
-        </w:rPr>
-        <w:t xml:space="preserve">. Health, vol. 11, Art. no. e50150, 2024, </w:t>
-      </w:r>
-      <w:proofErr w:type="spellStart"/>
-      <w:r>
-        <w:rPr>
-          <w:sz w:val="22"/>
-          <w:szCs w:val="22"/>
-        </w:rPr>
-        <w:t>doi</w:t>
-      </w:r>
-      <w:proofErr w:type="spellEnd"/>
-      <w:r>
-        <w:rPr>
-          <w:sz w:val="22"/>
-          <w:szCs w:val="22"/>
-        </w:rPr>
-        <w:t>: 10.2196/50150.</w:t>
+        <w:t>J. A. Lossio-Ventura, R. Weger, A. Y. Lee, E. P. Guinee, J. Chung, L. Atlas, E. Linos, and F. Pereira, "A comparison of ChatGPT and fine-tuned open pre-trained transformers (OPT) against widely used sentiment analysis tools: Sentiment analysis of COVID-19 survey data," JMIR Ment. Health, vol. 11, Art. no. e50150, 2024, doi: 10.2196/50150.</w:t>
       </w:r>
     </w:p>
     <w:p>
@@ -21165,23 +18811,7 @@
           <w:szCs w:val="22"/>
         </w:rPr>
         <w:tab/>
-        <w:t xml:space="preserve">M. Jones, J. Bradley, and N. </w:t>
-      </w:r>
-      <w:proofErr w:type="spellStart"/>
-      <w:r>
-        <w:rPr>
-          <w:sz w:val="22"/>
-          <w:szCs w:val="22"/>
-        </w:rPr>
-        <w:t>Sakimura</w:t>
-      </w:r>
-      <w:proofErr w:type="spellEnd"/>
-      <w:r>
-        <w:rPr>
-          <w:sz w:val="22"/>
-          <w:szCs w:val="22"/>
-        </w:rPr>
-        <w:t>, "JSON Web Token (JWT)," RFC 7519, IETF, May 2015.</w:t>
+        <w:t>M. Jones, J. Bradley, and N. Sakimura, "JSON Web Token (JWT)," RFC 7519, IETF, May 2015.</w:t>
       </w:r>
     </w:p>
     <w:p>
@@ -21205,39 +18835,7 @@
           <w:szCs w:val="22"/>
         </w:rPr>
         <w:tab/>
-        <w:t xml:space="preserve">W. Antoun, F. </w:t>
-      </w:r>
-      <w:proofErr w:type="spellStart"/>
-      <w:r>
-        <w:rPr>
-          <w:sz w:val="22"/>
-          <w:szCs w:val="22"/>
-        </w:rPr>
-        <w:t>Baly</w:t>
-      </w:r>
-      <w:proofErr w:type="spellEnd"/>
-      <w:r>
-        <w:rPr>
-          <w:sz w:val="22"/>
-          <w:szCs w:val="22"/>
-        </w:rPr>
-        <w:t>, and H. Hajj, "</w:t>
-      </w:r>
-      <w:proofErr w:type="spellStart"/>
-      <w:r>
-        <w:rPr>
-          <w:sz w:val="22"/>
-          <w:szCs w:val="22"/>
-        </w:rPr>
-        <w:t>AraBERT</w:t>
-      </w:r>
-      <w:proofErr w:type="spellEnd"/>
-      <w:r>
-        <w:rPr>
-          <w:sz w:val="22"/>
-          <w:szCs w:val="22"/>
-        </w:rPr>
-        <w:t>: Transformer-based model for Arabic language understanding," in Proc. 4th Workshop on Open-Source Arabic Corpora and Processing Tools (OSACT4), Marseille, France, 2020.</w:t>
+        <w:t>W. Antoun, F. Baly, and H. Hajj, "AraBERT: Transformer-based model for Arabic language understanding," in Proc. 4th Workshop on Open-Source Arabic Corpora and Processing Tools (OSACT4), Marseille, France, 2020.</w:t>
       </w:r>
     </w:p>
     <w:p>
@@ -21262,71 +18860,7 @@
           <w:szCs w:val="22"/>
         </w:rPr>
         <w:tab/>
-        <w:t xml:space="preserve">G. Inoue, B. </w:t>
-      </w:r>
-      <w:proofErr w:type="spellStart"/>
-      <w:r>
-        <w:rPr>
-          <w:sz w:val="22"/>
-          <w:szCs w:val="22"/>
-        </w:rPr>
-        <w:t>Alhafni</w:t>
-      </w:r>
-      <w:proofErr w:type="spellEnd"/>
-      <w:r>
-        <w:rPr>
-          <w:sz w:val="22"/>
-          <w:szCs w:val="22"/>
-        </w:rPr>
-        <w:t xml:space="preserve">, N. </w:t>
-      </w:r>
-      <w:proofErr w:type="spellStart"/>
-      <w:r>
-        <w:rPr>
-          <w:sz w:val="22"/>
-          <w:szCs w:val="22"/>
-        </w:rPr>
-        <w:t>Baimukan</w:t>
-      </w:r>
-      <w:proofErr w:type="spellEnd"/>
-      <w:r>
-        <w:rPr>
-          <w:sz w:val="22"/>
-          <w:szCs w:val="22"/>
-        </w:rPr>
-        <w:t xml:space="preserve">, H. </w:t>
-      </w:r>
-      <w:proofErr w:type="spellStart"/>
-      <w:r>
-        <w:rPr>
-          <w:sz w:val="22"/>
-          <w:szCs w:val="22"/>
-        </w:rPr>
-        <w:t>Bouamor</w:t>
-      </w:r>
-      <w:proofErr w:type="spellEnd"/>
-      <w:r>
-        <w:rPr>
-          <w:sz w:val="22"/>
-          <w:szCs w:val="22"/>
-        </w:rPr>
-        <w:t xml:space="preserve">, and N. </w:t>
-      </w:r>
-      <w:proofErr w:type="spellStart"/>
-      <w:r>
-        <w:rPr>
-          <w:sz w:val="22"/>
-          <w:szCs w:val="22"/>
-        </w:rPr>
-        <w:t>Habash</w:t>
-      </w:r>
-      <w:proofErr w:type="spellEnd"/>
-      <w:r>
-        <w:rPr>
-          <w:sz w:val="22"/>
-          <w:szCs w:val="22"/>
-        </w:rPr>
-        <w:t>, "The interplay of variant, size, and task type in Arabic pre-trained language models," in Proc. 6th Arabic Natural Language Processing Workshop (WANLP), 2021.</w:t>
+        <w:t>G. Inoue, B. Alhafni, N. Baimukan, H. Bouamor, and N. Habash, "The interplay of variant, size, and task type in Arabic pre-trained language models," in Proc. 6th Arabic Natural Language Processing Workshop (WANLP), 2021.</w:t>
       </w:r>
     </w:p>
     <w:p>
@@ -21350,71 +18884,7 @@
           <w:szCs w:val="22"/>
         </w:rPr>
         <w:tab/>
-        <w:t>M. Abdul-</w:t>
-      </w:r>
-      <w:proofErr w:type="spellStart"/>
-      <w:r>
-        <w:rPr>
-          <w:sz w:val="22"/>
-          <w:szCs w:val="22"/>
-        </w:rPr>
-        <w:t>Mageed</w:t>
-      </w:r>
-      <w:proofErr w:type="spellEnd"/>
-      <w:r>
-        <w:rPr>
-          <w:sz w:val="22"/>
-          <w:szCs w:val="22"/>
-        </w:rPr>
-        <w:t xml:space="preserve">, A. </w:t>
-      </w:r>
-      <w:proofErr w:type="spellStart"/>
-      <w:r>
-        <w:rPr>
-          <w:sz w:val="22"/>
-          <w:szCs w:val="22"/>
-        </w:rPr>
-        <w:t>Elmadany</w:t>
-      </w:r>
-      <w:proofErr w:type="spellEnd"/>
-      <w:r>
-        <w:rPr>
-          <w:sz w:val="22"/>
-          <w:szCs w:val="22"/>
-        </w:rPr>
-        <w:t xml:space="preserve">, and E. M. B. </w:t>
-      </w:r>
-      <w:proofErr w:type="spellStart"/>
-      <w:r>
-        <w:rPr>
-          <w:sz w:val="22"/>
-          <w:szCs w:val="22"/>
-        </w:rPr>
-        <w:t>Nagoudi</w:t>
-      </w:r>
-      <w:proofErr w:type="spellEnd"/>
-      <w:r>
-        <w:rPr>
-          <w:sz w:val="22"/>
-          <w:szCs w:val="22"/>
-        </w:rPr>
-        <w:t xml:space="preserve">, "ARBERT &amp; MARBERT: Deep bidirectional transformers for Arabic," in Proc. ACL-IJCNLP, 2021, </w:t>
-      </w:r>
-      <w:proofErr w:type="spellStart"/>
-      <w:r>
-        <w:rPr>
-          <w:sz w:val="22"/>
-          <w:szCs w:val="22"/>
-        </w:rPr>
-        <w:t>doi</w:t>
-      </w:r>
-      <w:proofErr w:type="spellEnd"/>
-      <w:r>
-        <w:rPr>
-          <w:sz w:val="22"/>
-          <w:szCs w:val="22"/>
-        </w:rPr>
-        <w:t>: 10.18653/v1/2021.acl-long.551.</w:t>
+        <w:t>M. Abdul-Mageed, A. Elmadany, and E. M. B. Nagoudi, "ARBERT &amp; MARBERT: Deep bidirectional transformers for Arabic," in Proc. ACL-IJCNLP, 2021, doi: 10.18653/v1/2021.acl-long.551.</w:t>
       </w:r>
     </w:p>
     <w:p>
@@ -21486,22 +18956,7 @@
           <w:szCs w:val="22"/>
         </w:rPr>
         <w:tab/>
-      </w:r>
-      <w:proofErr w:type="spellStart"/>
-      <w:r>
-        <w:rPr>
-          <w:sz w:val="22"/>
-          <w:szCs w:val="22"/>
-        </w:rPr>
-        <w:t>Typeform</w:t>
-      </w:r>
-      <w:proofErr w:type="spellEnd"/>
-      <w:r>
-        <w:rPr>
-          <w:sz w:val="22"/>
-          <w:szCs w:val="22"/>
-        </w:rPr>
-        <w:t>, "Prevent duplicate responses," help.typeform.com. [Online]. Available: https://help.typeform.com/hc/en-us/articles/27917825492244 (accessed Oct. 23, 2026).</w:t>
+        <w:t>Typeform, "Prevent duplicate responses," help.typeform.com. [Online]. Available: https://help.typeform.com/hc/en-us/articles/27917825492244 (accessed Oct. 23, 2026).</w:t>
       </w:r>
     </w:p>
     <w:p>
@@ -21621,38 +19076,7 @@
           <w:szCs w:val="22"/>
         </w:rPr>
         <w:tab/>
-      </w:r>
-      <w:proofErr w:type="spellStart"/>
-      <w:r>
-        <w:rPr>
-          <w:sz w:val="22"/>
-          <w:szCs w:val="22"/>
-        </w:rPr>
-        <w:t>Pollfish</w:t>
-      </w:r>
-      <w:proofErr w:type="spellEnd"/>
-      <w:r>
-        <w:rPr>
-          <w:sz w:val="22"/>
-          <w:szCs w:val="22"/>
-        </w:rPr>
-        <w:t xml:space="preserve">, "How the </w:t>
-      </w:r>
-      <w:proofErr w:type="spellStart"/>
-      <w:r>
-        <w:rPr>
-          <w:sz w:val="22"/>
-          <w:szCs w:val="22"/>
-        </w:rPr>
-        <w:t>Pollfish</w:t>
-      </w:r>
-      <w:proofErr w:type="spellEnd"/>
-      <w:r>
-        <w:rPr>
-          <w:sz w:val="22"/>
-          <w:szCs w:val="22"/>
-        </w:rPr>
-        <w:t xml:space="preserve"> methodology works," pollfish.com. [Online]. Available: https://www.pollfish.com/resources/blog/pollfish-school/how-the-pollfish-methodology-works/ (accessed Oct. 23, 2026).</w:t>
+        <w:t>Pollfish, "How the Pollfish methodology works," pollfish.com. [Online]. Available: https://www.pollfish.com/resources/blog/pollfish-school/how-the-pollfish-methodology-works/ (accessed Oct. 23, 2026).</w:t>
       </w:r>
     </w:p>
     <w:p>
@@ -21676,38 +19100,7 @@
           <w:szCs w:val="22"/>
         </w:rPr>
         <w:tab/>
-      </w:r>
-      <w:proofErr w:type="spellStart"/>
-      <w:r>
-        <w:rPr>
-          <w:sz w:val="22"/>
-          <w:szCs w:val="22"/>
-        </w:rPr>
-        <w:t>Pollfish</w:t>
-      </w:r>
-      <w:proofErr w:type="spellEnd"/>
-      <w:r>
-        <w:rPr>
-          <w:sz w:val="22"/>
-          <w:szCs w:val="22"/>
-        </w:rPr>
-        <w:t xml:space="preserve">, "The </w:t>
-      </w:r>
-      <w:proofErr w:type="spellStart"/>
-      <w:r>
-        <w:rPr>
-          <w:sz w:val="22"/>
-          <w:szCs w:val="22"/>
-        </w:rPr>
-        <w:t>Pollfish</w:t>
-      </w:r>
-      <w:proofErr w:type="spellEnd"/>
-      <w:r>
-        <w:rPr>
-          <w:sz w:val="22"/>
-          <w:szCs w:val="22"/>
-        </w:rPr>
-        <w:t xml:space="preserve"> survey results dashboard," pollfish.com (accessed Oct. 27, 2026).</w:t>
+        <w:t>Pollfish, "The Pollfish survey results dashboard," pollfish.com (accessed Oct. 27, 2026).</w:t>
       </w:r>
     </w:p>
     <w:p>
@@ -21755,39 +19148,7 @@
           <w:szCs w:val="22"/>
         </w:rPr>
         <w:tab/>
-        <w:t xml:space="preserve">A. J. Berinsky, M. F. Margolis, and M. W. </w:t>
-      </w:r>
-      <w:proofErr w:type="spellStart"/>
-      <w:r>
-        <w:rPr>
-          <w:sz w:val="22"/>
-          <w:szCs w:val="22"/>
-        </w:rPr>
-        <w:t>Sances</w:t>
-      </w:r>
-      <w:proofErr w:type="spellEnd"/>
-      <w:r>
-        <w:rPr>
-          <w:sz w:val="22"/>
-          <w:szCs w:val="22"/>
-        </w:rPr>
-        <w:t xml:space="preserve">, "Separating the shirkers from the workers? Making sure respondents pay attention on self-administered surveys," Am. J. Polit. Sci., vol. 58, no. 3, pp. 739–753, 2014, </w:t>
-      </w:r>
-      <w:proofErr w:type="spellStart"/>
-      <w:r>
-        <w:rPr>
-          <w:sz w:val="22"/>
-          <w:szCs w:val="22"/>
-        </w:rPr>
-        <w:t>doi</w:t>
-      </w:r>
-      <w:proofErr w:type="spellEnd"/>
-      <w:r>
-        <w:rPr>
-          <w:sz w:val="22"/>
-          <w:szCs w:val="22"/>
-        </w:rPr>
-        <w:t>: 10.1111/ajps.12081.</w:t>
+        <w:t>A. J. Berinsky, M. F. Margolis, and M. W. Sances, "Separating the shirkers from the workers? Making sure respondents pay attention on self-administered surveys," Am. J. Polit. Sci., vol. 58, no. 3, pp. 739–753, 2014, doi: 10.1111/ajps.12081.</w:t>
       </w:r>
     </w:p>
     <w:p>
@@ -21811,71 +19172,7 @@
           <w:szCs w:val="22"/>
         </w:rPr>
         <w:tab/>
-        <w:t xml:space="preserve">R. </w:t>
-      </w:r>
-      <w:proofErr w:type="spellStart"/>
-      <w:r>
-        <w:rPr>
-          <w:sz w:val="22"/>
-          <w:szCs w:val="22"/>
-        </w:rPr>
-        <w:t>Greszki</w:t>
-      </w:r>
-      <w:proofErr w:type="spellEnd"/>
-      <w:r>
-        <w:rPr>
-          <w:sz w:val="22"/>
-          <w:szCs w:val="22"/>
-        </w:rPr>
-        <w:t xml:space="preserve">, M. Meyer, and H. Schoen, "Exploring the effects of removing 'too fast' responses and respondents from web surveys," Public </w:t>
-      </w:r>
-      <w:proofErr w:type="spellStart"/>
-      <w:r>
-        <w:rPr>
-          <w:sz w:val="22"/>
-          <w:szCs w:val="22"/>
-        </w:rPr>
-        <w:t>Opin</w:t>
-      </w:r>
-      <w:proofErr w:type="spellEnd"/>
-      <w:r>
-        <w:rPr>
-          <w:sz w:val="22"/>
-          <w:szCs w:val="22"/>
-        </w:rPr>
-        <w:t xml:space="preserve">. Q., vol. 79, no. 2, pp. 471–503, 2015, </w:t>
-      </w:r>
-      <w:proofErr w:type="spellStart"/>
-      <w:r>
-        <w:rPr>
-          <w:sz w:val="22"/>
-          <w:szCs w:val="22"/>
-        </w:rPr>
-        <w:t>doi</w:t>
-      </w:r>
-      <w:proofErr w:type="spellEnd"/>
-      <w:r>
-        <w:rPr>
-          <w:sz w:val="22"/>
-          <w:szCs w:val="22"/>
-        </w:rPr>
-        <w:t>: 10.1093/</w:t>
-      </w:r>
-      <w:proofErr w:type="spellStart"/>
-      <w:r>
-        <w:rPr>
-          <w:sz w:val="22"/>
-          <w:szCs w:val="22"/>
-        </w:rPr>
-        <w:t>poq</w:t>
-      </w:r>
-      <w:proofErr w:type="spellEnd"/>
-      <w:r>
-        <w:rPr>
-          <w:sz w:val="22"/>
-          <w:szCs w:val="22"/>
-        </w:rPr>
-        <w:t>/nfu058.</w:t>
+        <w:t>R. Greszki, M. Meyer, and H. Schoen, "Exploring the effects of removing 'too fast' responses and respondents from web surveys," Public Opin. Q., vol. 79, no. 2, pp. 471–503, 2015, doi: 10.1093/poq/nfu058.</w:t>
       </w:r>
     </w:p>
     <w:p>
@@ -21899,39 +19196,7 @@
           <w:szCs w:val="22"/>
         </w:rPr>
         <w:tab/>
-        <w:t xml:space="preserve">R. Kennedy, S. Clifford, T. Burleigh, P. D. Waggoner, R. Jewell, and N. J. G. Winter, "The shape of and solutions to the </w:t>
-      </w:r>
-      <w:proofErr w:type="spellStart"/>
-      <w:r>
-        <w:rPr>
-          <w:sz w:val="22"/>
-          <w:szCs w:val="22"/>
-        </w:rPr>
-        <w:t>MTurk</w:t>
-      </w:r>
-      <w:proofErr w:type="spellEnd"/>
-      <w:r>
-        <w:rPr>
-          <w:sz w:val="22"/>
-          <w:szCs w:val="22"/>
-        </w:rPr>
-        <w:t xml:space="preserve"> quality crisis," Polit. Sci. Res. Methods, vol. 8, no. 4, pp. 614–629, 2020, </w:t>
-      </w:r>
-      <w:proofErr w:type="spellStart"/>
-      <w:r>
-        <w:rPr>
-          <w:sz w:val="22"/>
-          <w:szCs w:val="22"/>
-        </w:rPr>
-        <w:t>doi</w:t>
-      </w:r>
-      <w:proofErr w:type="spellEnd"/>
-      <w:r>
-        <w:rPr>
-          <w:sz w:val="22"/>
-          <w:szCs w:val="22"/>
-        </w:rPr>
-        <w:t>: 10.1017/psrm.2020.6.</w:t>
+        <w:t>R. Kennedy, S. Clifford, T. Burleigh, P. D. Waggoner, R. Jewell, and N. J. G. Winter, "The shape of and solutions to the MTurk quality crisis," Polit. Sci. Res. Methods, vol. 8, no. 4, pp. 614–629, 2020, doi: 10.1017/psrm.2020.6.</w:t>
       </w:r>
     </w:p>
     <w:p>
@@ -21955,23 +19220,7 @@
           <w:szCs w:val="22"/>
         </w:rPr>
         <w:tab/>
-        <w:t xml:space="preserve">L. Sweeney, "k-anonymity: A model for protecting privacy," Int. J. Uncertain. Fuzziness </w:t>
-      </w:r>
-      <w:proofErr w:type="spellStart"/>
-      <w:r>
-        <w:rPr>
-          <w:sz w:val="22"/>
-          <w:szCs w:val="22"/>
-        </w:rPr>
-        <w:t>Knowl</w:t>
-      </w:r>
-      <w:proofErr w:type="spellEnd"/>
-      <w:r>
-        <w:rPr>
-          <w:sz w:val="22"/>
-          <w:szCs w:val="22"/>
-        </w:rPr>
-        <w:t>.-Based Syst., vol. 10, no. 5, pp. 557–570, 2002.</w:t>
+        <w:t>L. Sweeney, "k-anonymity: A model for protecting privacy," Int. J. Uncertain. Fuzziness Knowl.-Based Syst., vol. 10, no. 5, pp. 557–570, 2002.</w:t>
       </w:r>
     </w:p>
     <w:p>
@@ -21995,23 +19244,7 @@
           <w:szCs w:val="22"/>
         </w:rPr>
         <w:tab/>
-        <w:t xml:space="preserve">J. A. Krosnick and D. F. Alwin, "An evaluation of a cognitive theory of response-order effects in survey measurement," Public </w:t>
-      </w:r>
-      <w:proofErr w:type="spellStart"/>
-      <w:r>
-        <w:rPr>
-          <w:sz w:val="22"/>
-          <w:szCs w:val="22"/>
-        </w:rPr>
-        <w:t>Opin</w:t>
-      </w:r>
-      <w:proofErr w:type="spellEnd"/>
-      <w:r>
-        <w:rPr>
-          <w:sz w:val="22"/>
-          <w:szCs w:val="22"/>
-        </w:rPr>
-        <w:t>. Q., vol. 51, no. 2, pp. 201–219, 1987.</w:t>
+        <w:t>J. A. Krosnick and D. F. Alwin, "An evaluation of a cognitive theory of response-order effects in survey measurement," Public Opin. Q., vol. 51, no. 2, pp. 201–219, 1987.</w:t>
       </w:r>
     </w:p>
     <w:p>
@@ -22035,39 +19268,7 @@
           <w:szCs w:val="22"/>
         </w:rPr>
         <w:tab/>
-        <w:t>Agile Business Consortium, "</w:t>
-      </w:r>
-      <w:proofErr w:type="spellStart"/>
-      <w:r>
-        <w:rPr>
-          <w:sz w:val="22"/>
-          <w:szCs w:val="22"/>
-        </w:rPr>
-        <w:t>MoSCoW</w:t>
-      </w:r>
-      <w:proofErr w:type="spellEnd"/>
-      <w:r>
-        <w:rPr>
-          <w:sz w:val="22"/>
-          <w:szCs w:val="22"/>
-        </w:rPr>
-        <w:t xml:space="preserve"> </w:t>
-      </w:r>
-      <w:proofErr w:type="spellStart"/>
-      <w:r>
-        <w:rPr>
-          <w:sz w:val="22"/>
-          <w:szCs w:val="22"/>
-        </w:rPr>
-        <w:t>prioritisation</w:t>
-      </w:r>
-      <w:proofErr w:type="spellEnd"/>
-      <w:r>
-        <w:rPr>
-          <w:sz w:val="22"/>
-          <w:szCs w:val="22"/>
-        </w:rPr>
-        <w:t>," agilebusiness.org (accessed Oct. 26, 2026).</w:t>
+        <w:t>Agile Business Consortium, "MoSCoW prioritisation," agilebusiness.org (accessed Oct. 26, 2026).</w:t>
       </w:r>
     </w:p>
     <w:p>
@@ -22092,71 +19293,7 @@
           <w:szCs w:val="22"/>
         </w:rPr>
         <w:tab/>
-        <w:t xml:space="preserve">J. Mellon, J. Bailey, R. Scott, J. </w:t>
-      </w:r>
-      <w:proofErr w:type="spellStart"/>
-      <w:r>
-        <w:rPr>
-          <w:sz w:val="22"/>
-          <w:szCs w:val="22"/>
-        </w:rPr>
-        <w:t>Breckwoldt</w:t>
-      </w:r>
-      <w:proofErr w:type="spellEnd"/>
-      <w:r>
-        <w:rPr>
-          <w:sz w:val="22"/>
-          <w:szCs w:val="22"/>
-        </w:rPr>
-        <w:t xml:space="preserve">, M. </w:t>
-      </w:r>
-      <w:proofErr w:type="spellStart"/>
-      <w:r>
-        <w:rPr>
-          <w:sz w:val="22"/>
-          <w:szCs w:val="22"/>
-        </w:rPr>
-        <w:t>Miori</w:t>
-      </w:r>
-      <w:proofErr w:type="spellEnd"/>
-      <w:r>
-        <w:rPr>
-          <w:sz w:val="22"/>
-          <w:szCs w:val="22"/>
-        </w:rPr>
-        <w:t xml:space="preserve">, and P. </w:t>
-      </w:r>
-      <w:proofErr w:type="spellStart"/>
-      <w:r>
-        <w:rPr>
-          <w:sz w:val="22"/>
-          <w:szCs w:val="22"/>
-        </w:rPr>
-        <w:t>Schmedeman</w:t>
-      </w:r>
-      <w:proofErr w:type="spellEnd"/>
-      <w:r>
-        <w:rPr>
-          <w:sz w:val="22"/>
-          <w:szCs w:val="22"/>
-        </w:rPr>
-        <w:t xml:space="preserve">, "Do AIs know what the most important issue is? Using language models to code open-text social survey responses at scale," Res. Politics, vol. 11, no. 1, 2024, </w:t>
-      </w:r>
-      <w:proofErr w:type="spellStart"/>
-      <w:r>
-        <w:rPr>
-          <w:sz w:val="22"/>
-          <w:szCs w:val="22"/>
-        </w:rPr>
-        <w:t>doi</w:t>
-      </w:r>
-      <w:proofErr w:type="spellEnd"/>
-      <w:r>
-        <w:rPr>
-          <w:sz w:val="22"/>
-          <w:szCs w:val="22"/>
-        </w:rPr>
-        <w:t>: 10.1177/20531680241231468.</w:t>
+        <w:t>J. Mellon, J. Bailey, R. Scott, J. Breckwoldt, M. Miori, and P. Schmedeman, "Do AIs know what the most important issue is? Using language models to code open-text social survey responses at scale," Res. Politics, vol. 11, no. 1, 2024, doi: 10.1177/20531680241231468.</w:t>
       </w:r>
     </w:p>
     <w:p>
@@ -22180,23 +19317,7 @@
           <w:szCs w:val="22"/>
         </w:rPr>
         <w:tab/>
-        <w:t xml:space="preserve">W. Zhang, Y. Deng, B. Liu, S. J. Pan, and L. Bing, "Sentiment analysis in the era of large language models: A reality check," in Findings of the Association for Computational Linguistics: NAACL 2024, Mexico City, Mexico, 2024, pp. 3881–3906, </w:t>
-      </w:r>
-      <w:proofErr w:type="spellStart"/>
-      <w:r>
-        <w:rPr>
-          <w:sz w:val="22"/>
-          <w:szCs w:val="22"/>
-        </w:rPr>
-        <w:t>doi</w:t>
-      </w:r>
-      <w:proofErr w:type="spellEnd"/>
-      <w:r>
-        <w:rPr>
-          <w:sz w:val="22"/>
-          <w:szCs w:val="22"/>
-        </w:rPr>
-        <w:t>: 10.18653/v1/2024.findings-naacl.246.</w:t>
+        <w:t>W. Zhang, Y. Deng, B. Liu, S. J. Pan, and L. Bing, "Sentiment analysis in the era of large language models: A reality check," in Findings of the Association for Computational Linguistics: NAACL 2024, Mexico City, Mexico, 2024, pp. 3881–3906, doi: 10.18653/v1/2024.findings-naacl.246.</w:t>
       </w:r>
     </w:p>
     <w:sectPr>

</xml_diff>

<commit_message>
Update Smart Survey Platform - Graduation 1 - Report (Chapters 1-3, draft).docx
</commit_message>
<xml_diff>
--- a/documentation/graduation-1/Smart Survey Platform - Graduation 1 - Report (Chapters 1-3, draft).docx
+++ b/documentation/graduation-1/Smart Survey Platform - Graduation 1 - Report (Chapters 1-3, draft).docx
@@ -11538,7 +11538,7 @@
                 <w:sz w:val="22"/>
                 <w:szCs w:val="22"/>
               </w:rPr>
-              <w:t>Eng. Shadi Blidi, Eng. Mohammad Amer Khorshid</w:t>
+              <w:t xml:space="preserve">Eng. Shadi Blidi, </w:t>
             </w:r>
           </w:p>
         </w:tc>
@@ -11568,7 +11568,7 @@
                 <w:sz w:val="22"/>
                 <w:szCs w:val="22"/>
               </w:rPr>
-              <w:t>Stakeholders (supervisors)</w:t>
+              <w:t>Stakeholders (supervisor)</w:t>
             </w:r>
           </w:p>
         </w:tc>

</xml_diff>